<commit_message>
Added PII comments to the CBOR data
</commit_message>
<xml_diff>
--- a/defensive-publications/partial-encryption-full-signature.docx
+++ b/defensive-publications/partial-encryption-full-signature.docx
@@ -1,6 +1,6 @@
 
 <file path=word/document.xml><?xml version="1.0" encoding="utf-8"?>
-<w:document xmlns:wpc="http://schemas.microsoft.com/office/word/2010/wordprocessingCanvas" xmlns:cx="http://schemas.microsoft.com/office/drawing/2014/chartex" xmlns:cx1="http://schemas.microsoft.com/office/drawing/2015/9/8/chartex" xmlns:cx2="http://schemas.microsoft.com/office/drawing/2015/10/21/chartex" xmlns:cx3="http://schemas.microsoft.com/office/drawing/2016/5/9/chartex" xmlns:cx4="http://schemas.microsoft.com/office/drawing/2016/5/10/chartex" xmlns:cx5="http://schemas.microsoft.com/office/drawing/2016/5/11/chartex" xmlns:cx6="http://schemas.microsoft.com/office/drawing/2016/5/12/chartex" xmlns:cx7="http://schemas.microsoft.com/office/drawing/2016/5/13/chartex" xmlns:cx8="http://schemas.microsoft.com/office/drawing/2016/5/14/chartex" xmlns:mc="http://schemas.openxmlformats.org/markup-compatibility/2006" xmlns:aink="http://schemas.microsoft.com/office/drawing/2016/ink" xmlns:am3d="http://schemas.microsoft.com/office/drawing/2017/model3d" xmlns:o="urn:schemas-microsoft-com:office:office" xmlns:oel="http://schemas.microsoft.com/office/2019/extlst" xmlns:r="http://schemas.openxmlformats.org/officeDocument/2006/relationships" xmlns:m="http://schemas.openxmlformats.org/officeDocument/2006/math" xmlns:v="urn:schemas-microsoft-com:vml" xmlns:wp14="http://schemas.microsoft.com/office/word/2010/wordprocessingDrawing" xmlns:wp="http://schemas.openxmlformats.org/drawingml/2006/wordprocessingDrawing" xmlns:w10="urn:schemas-microsoft-com:office:word" xmlns:w="http://schemas.openxmlformats.org/wordprocessingml/2006/main" xmlns:w14="http://schemas.microsoft.com/office/word/2010/wordml" xmlns:w15="http://schemas.microsoft.com/office/word/2012/wordml" xmlns:w16cex="http://schemas.microsoft.com/office/word/2018/wordml/cex" xmlns:w16cid="http://schemas.microsoft.com/office/word/2016/wordml/cid" xmlns:w16="http://schemas.microsoft.com/office/word/2018/wordml" xmlns:w16du="http://schemas.microsoft.com/office/word/2023/wordml/word16du" xmlns:w16sdtdh="http://schemas.microsoft.com/office/word/2020/wordml/sdtdatahash" xmlns:w16se="http://schemas.microsoft.com/office/word/2015/wordml/symex" xmlns:wpg="http://schemas.microsoft.com/office/word/2010/wordprocessingGroup" xmlns:wpi="http://schemas.microsoft.com/office/word/2010/wordprocessingInk" xmlns:wne="http://schemas.microsoft.com/office/word/2006/wordml" xmlns:wps="http://schemas.microsoft.com/office/word/2010/wordprocessingShape" mc:Ignorable="w14 w15 w16se w16cid w16 w16cex w16sdtdh w16du wp14">
+<w:document xmlns:wpc="http://schemas.microsoft.com/office/word/2010/wordprocessingCanvas" xmlns:cx="http://schemas.microsoft.com/office/drawing/2014/chartex" xmlns:cx1="http://schemas.microsoft.com/office/drawing/2015/9/8/chartex" xmlns:cx2="http://schemas.microsoft.com/office/drawing/2015/10/21/chartex" xmlns:cx3="http://schemas.microsoft.com/office/drawing/2016/5/9/chartex" xmlns:cx4="http://schemas.microsoft.com/office/drawing/2016/5/10/chartex" xmlns:cx5="http://schemas.microsoft.com/office/drawing/2016/5/11/chartex" xmlns:cx6="http://schemas.microsoft.com/office/drawing/2016/5/12/chartex" xmlns:cx7="http://schemas.microsoft.com/office/drawing/2016/5/13/chartex" xmlns:cx8="http://schemas.microsoft.com/office/drawing/2016/5/14/chartex" xmlns:mc="http://schemas.openxmlformats.org/markup-compatibility/2006" xmlns:aink="http://schemas.microsoft.com/office/drawing/2016/ink" xmlns:am3d="http://schemas.microsoft.com/office/drawing/2017/model3d" xmlns:o="urn:schemas-microsoft-com:office:office" xmlns:oel="http://schemas.microsoft.com/office/2019/extlst" xmlns:r="http://schemas.openxmlformats.org/officeDocument/2006/relationships" xmlns:m="http://schemas.openxmlformats.org/officeDocument/2006/math" xmlns:v="urn:schemas-microsoft-com:vml" xmlns:wp14="http://schemas.microsoft.com/office/word/2010/wordprocessingDrawing" xmlns:wp="http://schemas.openxmlformats.org/drawingml/2006/wordprocessingDrawing" xmlns:w10="urn:schemas-microsoft-com:office:word" xmlns:w="http://schemas.openxmlformats.org/wordprocessingml/2006/main" xmlns:w14="http://schemas.microsoft.com/office/word/2010/wordml" xmlns:w15="http://schemas.microsoft.com/office/word/2012/wordml" xmlns:w16cex="http://schemas.microsoft.com/office/word/2018/wordml/cex" xmlns:w16cid="http://schemas.microsoft.com/office/word/2016/wordml/cid" xmlns:w16="http://schemas.microsoft.com/office/word/2018/wordml" xmlns:w16du="http://schemas.microsoft.com/office/word/2023/wordml/word16du" xmlns:w16sdtdh="http://schemas.microsoft.com/office/word/2020/wordml/sdtdatahash" xmlns:w16sdtfl="http://schemas.microsoft.com/office/word/2024/wordml/sdtformatlock" xmlns:w16se="http://schemas.microsoft.com/office/word/2015/wordml/symex" xmlns:wpg="http://schemas.microsoft.com/office/word/2010/wordprocessingGroup" xmlns:wpi="http://schemas.microsoft.com/office/word/2010/wordprocessingInk" xmlns:wne="http://schemas.microsoft.com/office/word/2006/wordml" xmlns:wps="http://schemas.microsoft.com/office/word/2010/wordprocessingShape" mc:Ignorable="w14 w15 w16se w16cid w16 w16cex w16sdtdh w16sdtfl w16du wp14">
   <w:body>
     <w:p>
       <w:pPr>
@@ -230,19 +230,27 @@
         <w:jc w:val="center"/>
         <w:rPr>
           <w:rFonts w:ascii="Arial" w:hAnsi="Arial" w:cs="Arial"/>
+          <w:iCs/>
+          <w:sz w:val="20"/>
+          <w:szCs w:val="20"/>
+        </w:rPr>
+      </w:pPr>
+      <w:r>
+        <w:rPr>
+          <w:rFonts w:ascii="Arial" w:hAnsi="Arial" w:cs="Arial"/>
           <w:i/>
           <w:sz w:val="20"/>
           <w:szCs w:val="20"/>
         </w:rPr>
-      </w:pPr>
-      <w:r>
-        <w:rPr>
-          <w:rFonts w:ascii="Arial" w:hAnsi="Arial" w:cs="Arial"/>
-          <w:i/>
-          <w:sz w:val="20"/>
-          <w:szCs w:val="20"/>
-        </w:rPr>
         <w:br/>
+      </w:r>
+      <w:r>
+        <w:rPr>
+          <w:rFonts w:ascii="Arial" w:hAnsi="Arial" w:cs="Arial"/>
+          <w:iCs/>
+          <w:sz w:val="20"/>
+          <w:szCs w:val="20"/>
+        </w:rPr>
         <w:t>ABSTRACT</w:t>
       </w:r>
     </w:p>
@@ -258,11 +266,497 @@
       <w:r>
         <w:rPr>
           <w:rFonts w:ascii="Arial" w:hAnsi="Arial" w:cs="Arial"/>
+          <w:iCs/>
+          <w:sz w:val="20"/>
+          <w:szCs w:val="20"/>
+        </w:rPr>
+        <w:t xml:space="preserve">This </w:t>
+      </w:r>
+      <w:r>
+        <w:rPr>
+          <w:rFonts w:ascii="Arial" w:hAnsi="Arial" w:cs="Arial"/>
+          <w:iCs/>
+          <w:sz w:val="20"/>
+          <w:szCs w:val="20"/>
+        </w:rPr>
+        <w:t>document</w:t>
+      </w:r>
+      <w:r>
+        <w:rPr>
+          <w:rFonts w:ascii="Arial" w:hAnsi="Arial" w:cs="Arial"/>
+          <w:iCs/>
+          <w:sz w:val="20"/>
+          <w:szCs w:val="20"/>
+        </w:rPr>
+        <w:t xml:space="preserve"> </w:t>
+      </w:r>
+      <w:r>
+        <w:rPr>
+          <w:rFonts w:ascii="Arial" w:hAnsi="Arial" w:cs="Arial"/>
+          <w:iCs/>
+          <w:sz w:val="20"/>
+          <w:szCs w:val="20"/>
+        </w:rPr>
+        <w:t xml:space="preserve">outlines a scheme </w:t>
+      </w:r>
+      <w:r>
+        <w:rPr>
+          <w:rFonts w:ascii="Arial" w:hAnsi="Arial" w:cs="Arial"/>
+          <w:iCs/>
+          <w:sz w:val="20"/>
+          <w:szCs w:val="20"/>
+        </w:rPr>
+        <w:t xml:space="preserve">where a </w:t>
+      </w:r>
+      <w:r>
+        <w:rPr>
+          <w:rFonts w:ascii="Arial" w:hAnsi="Arial" w:cs="Arial"/>
+          <w:iCs/>
+          <w:sz w:val="20"/>
+          <w:szCs w:val="20"/>
+        </w:rPr>
+        <w:t>Payee</w:t>
+      </w:r>
+      <w:r>
+        <w:rPr>
+          <w:rFonts w:ascii="Arial" w:hAnsi="Arial" w:cs="Arial"/>
+          <w:iCs/>
+          <w:sz w:val="20"/>
+          <w:szCs w:val="20"/>
+        </w:rPr>
+        <w:t xml:space="preserve">-originated </w:t>
+      </w:r>
+      <w:r>
+        <w:rPr>
+          <w:rFonts w:ascii="Consolas" w:hAnsi="Consolas" w:cs="Consolas"/>
+          <w:iCs/>
+          <w:sz w:val="20"/>
+          <w:szCs w:val="20"/>
+        </w:rPr>
+        <w:t>Authorization</w:t>
+      </w:r>
+      <w:r>
+        <w:rPr>
+          <w:rFonts w:ascii="Arial" w:hAnsi="Arial" w:cs="Arial"/>
+          <w:iCs/>
+          <w:sz w:val="20"/>
+          <w:szCs w:val="20"/>
+        </w:rPr>
+        <w:t xml:space="preserve"> </w:t>
+      </w:r>
+      <w:r>
+        <w:rPr>
+          <w:rFonts w:ascii="Consolas" w:hAnsi="Consolas" w:cs="Consolas"/>
+          <w:iCs/>
+          <w:sz w:val="20"/>
+          <w:szCs w:val="20"/>
+        </w:rPr>
+        <w:t>Request</w:t>
+      </w:r>
+      <w:r>
+        <w:rPr>
+          <w:rFonts w:ascii="Arial" w:hAnsi="Arial" w:cs="Arial"/>
+          <w:iCs/>
+          <w:sz w:val="20"/>
+          <w:szCs w:val="20"/>
+        </w:rPr>
+        <w:t xml:space="preserve"> </w:t>
+      </w:r>
+      <w:r>
+        <w:rPr>
+          <w:rFonts w:ascii="Arial" w:hAnsi="Arial" w:cs="Arial"/>
+          <w:iCs/>
+          <w:sz w:val="20"/>
+          <w:szCs w:val="20"/>
+        </w:rPr>
+        <w:t xml:space="preserve">is </w:t>
+      </w:r>
+      <w:r>
+        <w:rPr>
+          <w:rFonts w:ascii="Arial" w:hAnsi="Arial" w:cs="Arial"/>
+          <w:iCs/>
+          <w:sz w:val="20"/>
+          <w:szCs w:val="20"/>
+        </w:rPr>
+        <w:t>triggering</w:t>
+      </w:r>
+      <w:r>
+        <w:rPr>
+          <w:rFonts w:ascii="Arial" w:hAnsi="Arial" w:cs="Arial"/>
+          <w:iCs/>
+          <w:sz w:val="20"/>
+          <w:szCs w:val="20"/>
+        </w:rPr>
+        <w:t xml:space="preserve"> a</w:t>
+      </w:r>
+      <w:r>
+        <w:rPr>
+          <w:rFonts w:ascii="Arial" w:hAnsi="Arial" w:cs="Arial"/>
+          <w:iCs/>
+          <w:sz w:val="20"/>
+          <w:szCs w:val="20"/>
+        </w:rPr>
+        <w:t xml:space="preserve"> corresponding</w:t>
+      </w:r>
+      <w:r>
+        <w:rPr>
+          <w:rFonts w:ascii="Arial" w:hAnsi="Arial" w:cs="Arial"/>
+          <w:iCs/>
+          <w:sz w:val="20"/>
+          <w:szCs w:val="20"/>
+        </w:rPr>
+        <w:t xml:space="preserve"> </w:t>
+      </w:r>
+      <w:r>
+        <w:rPr>
+          <w:rFonts w:ascii="Consolas" w:hAnsi="Consolas" w:cs="Consolas"/>
+          <w:iCs/>
+          <w:sz w:val="20"/>
+          <w:szCs w:val="20"/>
+        </w:rPr>
+        <w:t>A</w:t>
+      </w:r>
+      <w:r>
+        <w:rPr>
+          <w:rFonts w:ascii="Consolas" w:hAnsi="Consolas" w:cs="Consolas"/>
+          <w:iCs/>
+          <w:sz w:val="20"/>
+          <w:szCs w:val="20"/>
+        </w:rPr>
+        <w:t>uthorization</w:t>
+      </w:r>
+      <w:r>
+        <w:rPr>
+          <w:rFonts w:ascii="Arial" w:hAnsi="Arial" w:cs="Arial"/>
+          <w:iCs/>
+          <w:sz w:val="20"/>
+          <w:szCs w:val="20"/>
+        </w:rPr>
+        <w:t> </w:t>
+      </w:r>
+      <w:r>
+        <w:rPr>
+          <w:rFonts w:ascii="Consolas" w:hAnsi="Consolas" w:cs="Consolas"/>
+          <w:iCs/>
+          <w:sz w:val="20"/>
+          <w:szCs w:val="20"/>
+        </w:rPr>
+        <w:t>Response</w:t>
+      </w:r>
+      <w:r>
+        <w:rPr>
+          <w:rFonts w:ascii="Arial" w:hAnsi="Arial" w:cs="Arial"/>
+          <w:iCs/>
+          <w:sz w:val="20"/>
+          <w:szCs w:val="20"/>
+        </w:rPr>
+        <w:t xml:space="preserve"> object, created by a </w:t>
+      </w:r>
+      <w:r>
+        <w:rPr>
+          <w:rFonts w:ascii="Arial" w:hAnsi="Arial" w:cs="Arial"/>
+          <w:iCs/>
+          <w:sz w:val="20"/>
+          <w:szCs w:val="20"/>
+        </w:rPr>
+        <w:t>Payment</w:t>
+      </w:r>
+      <w:r>
+        <w:rPr>
+          <w:rFonts w:ascii="Arial" w:hAnsi="Arial" w:cs="Arial"/>
+          <w:iCs/>
+          <w:sz w:val="20"/>
+          <w:szCs w:val="20"/>
+        </w:rPr>
+        <w:t> W</w:t>
+      </w:r>
+      <w:r>
+        <w:rPr>
+          <w:rFonts w:ascii="Arial" w:hAnsi="Arial" w:cs="Arial"/>
+          <w:iCs/>
+          <w:sz w:val="20"/>
+          <w:szCs w:val="20"/>
+        </w:rPr>
+        <w:t xml:space="preserve">allet under the </w:t>
+      </w:r>
+      <w:r>
+        <w:rPr>
+          <w:rFonts w:ascii="Arial" w:hAnsi="Arial" w:cs="Arial"/>
+          <w:iCs/>
+          <w:sz w:val="20"/>
+          <w:szCs w:val="20"/>
+        </w:rPr>
+        <w:t>P</w:t>
+      </w:r>
+      <w:r>
+        <w:rPr>
+          <w:rFonts w:ascii="Arial" w:hAnsi="Arial" w:cs="Arial"/>
+          <w:iCs/>
+          <w:sz w:val="20"/>
+          <w:szCs w:val="20"/>
+        </w:rPr>
+        <w:t>ayer’s supervision.</w:t>
+      </w:r>
+      <w:r>
+        <w:rPr>
+          <w:rFonts w:ascii="Arial" w:hAnsi="Arial" w:cs="Arial"/>
+          <w:iCs/>
+          <w:sz w:val="20"/>
+          <w:szCs w:val="20"/>
+        </w:rPr>
+        <w:br/>
+      </w:r>
+      <w:r>
+        <w:rPr>
+          <w:rFonts w:ascii="Arial" w:hAnsi="Arial" w:cs="Arial"/>
+          <w:iCs/>
+          <w:sz w:val="20"/>
+          <w:szCs w:val="20"/>
+        </w:rPr>
+        <w:t>The</w:t>
+      </w:r>
+      <w:r>
+        <w:rPr>
+          <w:rFonts w:ascii="Arial" w:hAnsi="Arial" w:cs="Arial"/>
+          <w:iCs/>
+          <w:sz w:val="20"/>
+          <w:szCs w:val="20"/>
+        </w:rPr>
+        <w:t xml:space="preserve"> </w:t>
+      </w:r>
+      <w:r>
+        <w:rPr>
+          <w:rFonts w:ascii="Consolas" w:hAnsi="Consolas" w:cs="Consolas"/>
+          <w:iCs/>
+          <w:sz w:val="20"/>
+          <w:szCs w:val="20"/>
+        </w:rPr>
+        <w:t>Authorization</w:t>
+      </w:r>
+      <w:r>
+        <w:rPr>
+          <w:rFonts w:ascii="Arial" w:hAnsi="Arial" w:cs="Arial"/>
+          <w:iCs/>
+          <w:sz w:val="20"/>
+          <w:szCs w:val="20"/>
+        </w:rPr>
+        <w:t> </w:t>
+      </w:r>
+      <w:r>
+        <w:rPr>
+          <w:rFonts w:ascii="Consolas" w:hAnsi="Consolas" w:cs="Consolas"/>
+          <w:iCs/>
+          <w:sz w:val="20"/>
+          <w:szCs w:val="20"/>
+        </w:rPr>
+        <w:t>Response</w:t>
+      </w:r>
+      <w:r>
+        <w:rPr>
+          <w:rFonts w:ascii="Arial" w:hAnsi="Arial" w:cs="Arial"/>
+          <w:iCs/>
+          <w:sz w:val="20"/>
+          <w:szCs w:val="20"/>
+        </w:rPr>
+        <w:t xml:space="preserve"> object contains both the</w:t>
+      </w:r>
+      <w:r>
+        <w:rPr>
+          <w:rFonts w:ascii="Arial" w:hAnsi="Arial" w:cs="Arial"/>
+          <w:iCs/>
+          <w:sz w:val="20"/>
+          <w:szCs w:val="20"/>
+        </w:rPr>
+        <w:t xml:space="preserve"> core of the</w:t>
+      </w:r>
+      <w:r>
+        <w:rPr>
+          <w:rFonts w:ascii="Arial" w:hAnsi="Arial" w:cs="Arial"/>
+          <w:iCs/>
+          <w:sz w:val="20"/>
+          <w:szCs w:val="20"/>
+        </w:rPr>
+        <w:t xml:space="preserve"> original </w:t>
+      </w:r>
+      <w:r>
+        <w:rPr>
+          <w:rFonts w:ascii="Consolas" w:hAnsi="Consolas" w:cs="Consolas"/>
+          <w:iCs/>
+          <w:sz w:val="20"/>
+          <w:szCs w:val="20"/>
+        </w:rPr>
+        <w:t>Authorization</w:t>
+      </w:r>
+      <w:r>
+        <w:rPr>
+          <w:rFonts w:ascii="Arial" w:hAnsi="Arial" w:cs="Arial"/>
+          <w:iCs/>
+          <w:sz w:val="20"/>
+          <w:szCs w:val="20"/>
+        </w:rPr>
+        <w:t xml:space="preserve"> </w:t>
+      </w:r>
+      <w:r>
+        <w:rPr>
+          <w:rFonts w:ascii="Consolas" w:hAnsi="Consolas" w:cs="Consolas"/>
+          <w:iCs/>
+          <w:sz w:val="20"/>
+          <w:szCs w:val="20"/>
+        </w:rPr>
+        <w:t>Request</w:t>
+      </w:r>
+      <w:r>
+        <w:rPr>
+          <w:rFonts w:ascii="Arial" w:hAnsi="Arial" w:cs="Arial"/>
+          <w:iCs/>
+          <w:sz w:val="20"/>
+          <w:szCs w:val="20"/>
+        </w:rPr>
+        <w:t xml:space="preserve"> object </w:t>
+      </w:r>
+      <w:r>
+        <w:rPr>
+          <w:rFonts w:ascii="Arial" w:hAnsi="Arial" w:cs="Arial"/>
+          <w:iCs/>
+          <w:sz w:val="20"/>
+          <w:szCs w:val="20"/>
+        </w:rPr>
+        <w:t xml:space="preserve">as well as data associated with a by the </w:t>
+      </w:r>
+      <w:r>
+        <w:rPr>
+          <w:rFonts w:ascii="Arial" w:hAnsi="Arial" w:cs="Arial"/>
+          <w:iCs/>
+          <w:sz w:val="20"/>
+          <w:szCs w:val="20"/>
+        </w:rPr>
+        <w:t>P</w:t>
+      </w:r>
+      <w:r>
+        <w:rPr>
+          <w:rFonts w:ascii="Arial" w:hAnsi="Arial" w:cs="Arial"/>
+          <w:iCs/>
+          <w:sz w:val="20"/>
+          <w:szCs w:val="20"/>
+        </w:rPr>
+        <w:t xml:space="preserve">ayer selected </w:t>
+      </w:r>
+      <w:r>
+        <w:rPr>
+          <w:rFonts w:ascii="Arial" w:hAnsi="Arial" w:cs="Arial"/>
+          <w:iCs/>
+          <w:sz w:val="20"/>
+          <w:szCs w:val="20"/>
+        </w:rPr>
+        <w:t>P</w:t>
+      </w:r>
+      <w:r>
+        <w:rPr>
+          <w:rFonts w:ascii="Arial" w:hAnsi="Arial" w:cs="Arial"/>
+          <w:iCs/>
+          <w:sz w:val="20"/>
+          <w:szCs w:val="20"/>
+        </w:rPr>
+        <w:t xml:space="preserve">ayment </w:t>
+      </w:r>
+      <w:r>
+        <w:rPr>
+          <w:rFonts w:ascii="Arial" w:hAnsi="Arial" w:cs="Arial"/>
+          <w:iCs/>
+          <w:sz w:val="20"/>
+          <w:szCs w:val="20"/>
+        </w:rPr>
+        <w:t>C</w:t>
+      </w:r>
+      <w:r>
+        <w:rPr>
+          <w:rFonts w:ascii="Arial" w:hAnsi="Arial" w:cs="Arial"/>
+          <w:iCs/>
+          <w:sz w:val="20"/>
+          <w:szCs w:val="20"/>
+        </w:rPr>
+        <w:t xml:space="preserve">redential. </w:t>
+      </w:r>
+      <w:r>
+        <w:rPr>
+          <w:rFonts w:ascii="Arial" w:hAnsi="Arial" w:cs="Arial"/>
+          <w:iCs/>
+          <w:sz w:val="20"/>
+          <w:szCs w:val="20"/>
+        </w:rPr>
+        <w:t xml:space="preserve"> </w:t>
+      </w:r>
+      <w:r>
+        <w:rPr>
+          <w:rFonts w:ascii="Arial" w:hAnsi="Arial" w:cs="Arial"/>
+          <w:iCs/>
+          <w:sz w:val="20"/>
+          <w:szCs w:val="20"/>
+        </w:rPr>
+        <w:t xml:space="preserve">All </w:t>
+      </w:r>
+      <w:r>
+        <w:rPr>
+          <w:rFonts w:ascii="Arial" w:hAnsi="Arial" w:cs="Arial"/>
+          <w:iCs/>
+          <w:sz w:val="20"/>
+          <w:szCs w:val="20"/>
+        </w:rPr>
+        <w:t xml:space="preserve">data </w:t>
+      </w:r>
+      <w:r>
+        <w:rPr>
+          <w:rFonts w:ascii="Arial" w:hAnsi="Arial" w:cs="Arial"/>
+          <w:iCs/>
+          <w:sz w:val="20"/>
+          <w:szCs w:val="20"/>
+        </w:rPr>
+        <w:t>returned</w:t>
+      </w:r>
+      <w:r>
+        <w:rPr>
+          <w:rFonts w:ascii="Arial" w:hAnsi="Arial" w:cs="Arial"/>
+          <w:iCs/>
+          <w:sz w:val="20"/>
+          <w:szCs w:val="20"/>
+        </w:rPr>
+        <w:t xml:space="preserve"> </w:t>
+      </w:r>
+      <w:r>
+        <w:rPr>
+          <w:rFonts w:ascii="Arial" w:hAnsi="Arial" w:cs="Arial"/>
+          <w:iCs/>
+          <w:sz w:val="20"/>
+          <w:szCs w:val="20"/>
+        </w:rPr>
+        <w:t xml:space="preserve">is signed by a </w:t>
+      </w:r>
+      <w:r>
+        <w:rPr>
+          <w:rFonts w:ascii="Arial" w:hAnsi="Arial" w:cs="Arial"/>
           <w:i/>
           <w:sz w:val="20"/>
           <w:szCs w:val="20"/>
         </w:rPr>
-        <w:t xml:space="preserve">This </w:t>
+        <w:t>single signature</w:t>
+      </w:r>
+      <w:r>
+        <w:rPr>
+          <w:rFonts w:ascii="Arial" w:hAnsi="Arial" w:cs="Arial"/>
+          <w:iCs/>
+          <w:sz w:val="20"/>
+          <w:szCs w:val="20"/>
+        </w:rPr>
+        <w:t xml:space="preserve"> associated with the selected </w:t>
+      </w:r>
+      <w:r>
+        <w:rPr>
+          <w:rFonts w:ascii="Arial" w:hAnsi="Arial" w:cs="Arial"/>
+          <w:iCs/>
+          <w:sz w:val="20"/>
+          <w:szCs w:val="20"/>
+        </w:rPr>
+        <w:t xml:space="preserve">Payment Credential.  For </w:t>
       </w:r>
       <w:r>
         <w:rPr>
@@ -271,7 +765,70 @@
           <w:sz w:val="20"/>
           <w:szCs w:val="20"/>
         </w:rPr>
-        <w:t>document</w:t>
+        <w:t>privacy reasons</w:t>
+      </w:r>
+      <w:r>
+        <w:rPr>
+          <w:rFonts w:ascii="Arial" w:hAnsi="Arial" w:cs="Arial"/>
+          <w:iCs/>
+          <w:sz w:val="20"/>
+          <w:szCs w:val="20"/>
+        </w:rPr>
+        <w:t xml:space="preserve"> (with respect the </w:t>
+      </w:r>
+      <w:r>
+        <w:rPr>
+          <w:rFonts w:ascii="Arial" w:hAnsi="Arial" w:cs="Arial"/>
+          <w:iCs/>
+          <w:sz w:val="20"/>
+          <w:szCs w:val="20"/>
+        </w:rPr>
+        <w:t>Payee</w:t>
+      </w:r>
+      <w:r>
+        <w:rPr>
+          <w:rFonts w:ascii="Arial" w:hAnsi="Arial" w:cs="Arial"/>
+          <w:iCs/>
+          <w:sz w:val="20"/>
+          <w:szCs w:val="20"/>
+        </w:rPr>
+        <w:t>)</w:t>
+      </w:r>
+      <w:r>
+        <w:rPr>
+          <w:rFonts w:ascii="Arial" w:hAnsi="Arial" w:cs="Arial"/>
+          <w:iCs/>
+          <w:sz w:val="20"/>
+          <w:szCs w:val="20"/>
+        </w:rPr>
+        <w:t xml:space="preserve">, </w:t>
+      </w:r>
+      <w:r>
+        <w:rPr>
+          <w:rFonts w:ascii="Arial" w:hAnsi="Arial" w:cs="Arial"/>
+          <w:iCs/>
+          <w:sz w:val="20"/>
+          <w:szCs w:val="20"/>
+        </w:rPr>
+        <w:t>P</w:t>
+      </w:r>
+      <w:r>
+        <w:rPr>
+          <w:rFonts w:ascii="Arial" w:hAnsi="Arial" w:cs="Arial"/>
+          <w:iCs/>
+          <w:sz w:val="20"/>
+          <w:szCs w:val="20"/>
+        </w:rPr>
+        <w:t xml:space="preserve">ersonally Identifiable Information (PII) </w:t>
+      </w:r>
+      <w:r>
+        <w:rPr>
+          <w:rFonts w:ascii="Arial" w:hAnsi="Arial" w:cs="Arial"/>
+          <w:iCs/>
+          <w:sz w:val="20"/>
+          <w:szCs w:val="20"/>
+        </w:rPr>
+        <w:t xml:space="preserve">is </w:t>
       </w:r>
       <w:r>
         <w:rPr>
@@ -280,628 +837,178 @@
           <w:sz w:val="20"/>
           <w:szCs w:val="20"/>
         </w:rPr>
+        <w:t>encrypted</w:t>
+      </w:r>
+      <w:r>
+        <w:rPr>
+          <w:rFonts w:ascii="Arial" w:hAnsi="Arial" w:cs="Arial"/>
+          <w:iCs/>
+          <w:sz w:val="20"/>
+          <w:szCs w:val="20"/>
+        </w:rPr>
+        <w:t xml:space="preserve">, while the </w:t>
+      </w:r>
+      <w:r>
+        <w:rPr>
+          <w:rFonts w:ascii="Consolas" w:hAnsi="Consolas" w:cs="Consolas"/>
+          <w:iCs/>
+          <w:sz w:val="20"/>
+          <w:szCs w:val="20"/>
+        </w:rPr>
+        <w:t>Authorization</w:t>
+      </w:r>
+      <w:r>
+        <w:rPr>
+          <w:rFonts w:ascii="Arial" w:hAnsi="Arial" w:cs="Arial"/>
+          <w:iCs/>
+          <w:sz w:val="20"/>
+          <w:szCs w:val="20"/>
+        </w:rPr>
         <w:t xml:space="preserve"> </w:t>
       </w:r>
       <w:r>
         <w:rPr>
+          <w:rFonts w:ascii="Consolas" w:hAnsi="Consolas" w:cs="Consolas"/>
+          <w:iCs/>
+          <w:sz w:val="20"/>
+          <w:szCs w:val="20"/>
+        </w:rPr>
+        <w:t>Request</w:t>
+      </w:r>
+      <w:r>
+        <w:rPr>
+          <w:rFonts w:ascii="Arial" w:hAnsi="Arial" w:cs="Arial"/>
+          <w:iCs/>
+          <w:sz w:val="20"/>
+          <w:szCs w:val="20"/>
+        </w:rPr>
+        <w:t xml:space="preserve"> as well as non-personal data related to the Payment Network associated with the selected Payment Credential, is </w:t>
+      </w:r>
+      <w:r>
+        <w:rPr>
+          <w:rFonts w:ascii="Arial" w:hAnsi="Arial" w:cs="Arial"/>
+          <w:iCs/>
+          <w:sz w:val="20"/>
+          <w:szCs w:val="20"/>
+        </w:rPr>
+        <w:t>provided</w:t>
+      </w:r>
+      <w:r>
+        <w:rPr>
+          <w:rFonts w:ascii="Arial" w:hAnsi="Arial" w:cs="Arial"/>
+          <w:iCs/>
+          <w:sz w:val="20"/>
+          <w:szCs w:val="20"/>
+        </w:rPr>
+        <w:t xml:space="preserve"> in clear to </w:t>
+      </w:r>
+      <w:r>
+        <w:rPr>
+          <w:rFonts w:ascii="Arial" w:hAnsi="Arial" w:cs="Arial"/>
+          <w:iCs/>
+          <w:sz w:val="20"/>
+          <w:szCs w:val="20"/>
+        </w:rPr>
+        <w:t>facilitate</w:t>
+      </w:r>
+      <w:r>
+        <w:rPr>
+          <w:rFonts w:ascii="Arial" w:hAnsi="Arial" w:cs="Arial"/>
+          <w:iCs/>
+          <w:sz w:val="20"/>
+          <w:szCs w:val="20"/>
+        </w:rPr>
+        <w:t xml:space="preserve"> </w:t>
+      </w:r>
+      <w:r>
+        <w:rPr>
+          <w:rFonts w:ascii="Arial" w:hAnsi="Arial" w:cs="Arial"/>
+          <w:iCs/>
+          <w:sz w:val="20"/>
+          <w:szCs w:val="20"/>
+        </w:rPr>
+        <w:t>backend</w:t>
+      </w:r>
+      <w:r>
+        <w:rPr>
+          <w:rFonts w:ascii="Arial" w:hAnsi="Arial" w:cs="Arial"/>
+          <w:iCs/>
+          <w:sz w:val="20"/>
+          <w:szCs w:val="20"/>
+        </w:rPr>
+        <w:t xml:space="preserve"> processing</w:t>
+      </w:r>
+      <w:r>
+        <w:rPr>
+          <w:rFonts w:ascii="Arial" w:hAnsi="Arial" w:cs="Arial"/>
+          <w:iCs/>
+          <w:sz w:val="20"/>
+          <w:szCs w:val="20"/>
+        </w:rPr>
+        <w:t>.</w:t>
+      </w:r>
+      <w:r>
+        <w:rPr>
+          <w:rFonts w:ascii="Arial" w:hAnsi="Arial" w:cs="Arial"/>
+          <w:iCs/>
+          <w:sz w:val="20"/>
+          <w:szCs w:val="20"/>
+        </w:rPr>
+        <w:t xml:space="preserve">  The </w:t>
+      </w:r>
+      <w:r>
+        <w:rPr>
+          <w:rFonts w:ascii="Arial" w:hAnsi="Arial" w:cs="Arial"/>
+          <w:iCs/>
+          <w:sz w:val="20"/>
+          <w:szCs w:val="20"/>
+        </w:rPr>
+        <w:t xml:space="preserve">described </w:t>
+      </w:r>
+      <w:r>
+        <w:rPr>
+          <w:rFonts w:ascii="Arial" w:hAnsi="Arial" w:cs="Arial"/>
+          <w:iCs/>
+          <w:sz w:val="20"/>
+          <w:szCs w:val="20"/>
+        </w:rPr>
+        <w:t xml:space="preserve">scheme </w:t>
+      </w:r>
+      <w:r>
+        <w:rPr>
+          <w:rFonts w:ascii="Arial" w:hAnsi="Arial" w:cs="Arial"/>
+          <w:iCs/>
+          <w:sz w:val="20"/>
+          <w:szCs w:val="20"/>
+        </w:rPr>
+        <w:t xml:space="preserve">builds </w:t>
+      </w:r>
+      <w:r>
+        <w:rPr>
+          <w:rFonts w:ascii="Arial" w:hAnsi="Arial" w:cs="Arial"/>
+          <w:iCs/>
+          <w:sz w:val="20"/>
+          <w:szCs w:val="20"/>
+        </w:rPr>
+        <w:t>on</w:t>
+      </w:r>
+      <w:r>
+        <w:rPr>
+          <w:rFonts w:ascii="Arial" w:hAnsi="Arial" w:cs="Arial"/>
+          <w:iCs/>
+          <w:sz w:val="20"/>
+          <w:szCs w:val="20"/>
+        </w:rPr>
+        <w:t xml:space="preserve"> CBOR</w:t>
+      </w:r>
+      <w:r>
+        <w:rPr>
           <w:rFonts w:ascii="Arial" w:hAnsi="Arial" w:cs="Arial"/>
           <w:i/>
           <w:sz w:val="20"/>
           <w:szCs w:val="20"/>
         </w:rPr>
-        <w:t xml:space="preserve">outlines a scheme </w:t>
-      </w:r>
-      <w:r>
-        <w:rPr>
-          <w:rFonts w:ascii="Arial" w:hAnsi="Arial" w:cs="Arial"/>
-          <w:i/>
-          <w:sz w:val="20"/>
-          <w:szCs w:val="20"/>
-        </w:rPr>
-        <w:t xml:space="preserve">where a </w:t>
-      </w:r>
-      <w:r>
-        <w:rPr>
-          <w:rFonts w:ascii="Arial" w:hAnsi="Arial" w:cs="Arial"/>
-          <w:i/>
-          <w:sz w:val="20"/>
-          <w:szCs w:val="20"/>
-        </w:rPr>
-        <w:t>Payee</w:t>
-      </w:r>
-      <w:r>
-        <w:rPr>
-          <w:rFonts w:ascii="Arial" w:hAnsi="Arial" w:cs="Arial"/>
-          <w:i/>
-          <w:sz w:val="20"/>
-          <w:szCs w:val="20"/>
-        </w:rPr>
-        <w:t xml:space="preserve">-originated </w:t>
-      </w:r>
-      <w:r>
-        <w:rPr>
-          <w:rFonts w:ascii="Consolas" w:hAnsi="Consolas" w:cs="Consolas"/>
-          <w:i/>
-          <w:sz w:val="20"/>
-          <w:szCs w:val="20"/>
-        </w:rPr>
-        <w:t>Authorization</w:t>
-      </w:r>
-      <w:r>
-        <w:rPr>
-          <w:rFonts w:ascii="Arial" w:hAnsi="Arial" w:cs="Arial"/>
-          <w:i/>
-          <w:sz w:val="20"/>
-          <w:szCs w:val="20"/>
-        </w:rPr>
-        <w:t xml:space="preserve"> </w:t>
-      </w:r>
-      <w:r>
-        <w:rPr>
-          <w:rFonts w:ascii="Consolas" w:hAnsi="Consolas" w:cs="Consolas"/>
-          <w:i/>
-          <w:sz w:val="20"/>
-          <w:szCs w:val="20"/>
-        </w:rPr>
-        <w:t>Request</w:t>
-      </w:r>
-      <w:r>
-        <w:rPr>
-          <w:rFonts w:ascii="Arial" w:hAnsi="Arial" w:cs="Arial"/>
-          <w:i/>
-          <w:sz w:val="20"/>
-          <w:szCs w:val="20"/>
-        </w:rPr>
-        <w:t xml:space="preserve"> </w:t>
-      </w:r>
-      <w:r>
-        <w:rPr>
-          <w:rFonts w:ascii="Arial" w:hAnsi="Arial" w:cs="Arial"/>
-          <w:i/>
-          <w:sz w:val="20"/>
-          <w:szCs w:val="20"/>
-        </w:rPr>
-        <w:t xml:space="preserve">is </w:t>
-      </w:r>
-      <w:r>
-        <w:rPr>
-          <w:rFonts w:ascii="Arial" w:hAnsi="Arial" w:cs="Arial"/>
-          <w:i/>
-          <w:sz w:val="20"/>
-          <w:szCs w:val="20"/>
-        </w:rPr>
-        <w:t>triggering</w:t>
-      </w:r>
-      <w:r>
-        <w:rPr>
-          <w:rFonts w:ascii="Arial" w:hAnsi="Arial" w:cs="Arial"/>
-          <w:i/>
-          <w:sz w:val="20"/>
-          <w:szCs w:val="20"/>
-        </w:rPr>
-        <w:t xml:space="preserve"> a</w:t>
-      </w:r>
-      <w:r>
-        <w:rPr>
-          <w:rFonts w:ascii="Arial" w:hAnsi="Arial" w:cs="Arial"/>
-          <w:i/>
-          <w:sz w:val="20"/>
-          <w:szCs w:val="20"/>
-        </w:rPr>
-        <w:t xml:space="preserve"> corresponding</w:t>
-      </w:r>
-      <w:r>
-        <w:rPr>
-          <w:rFonts w:ascii="Arial" w:hAnsi="Arial" w:cs="Arial"/>
-          <w:i/>
-          <w:sz w:val="20"/>
-          <w:szCs w:val="20"/>
-        </w:rPr>
-        <w:t xml:space="preserve"> </w:t>
-      </w:r>
-      <w:r>
-        <w:rPr>
-          <w:rFonts w:ascii="Consolas" w:hAnsi="Consolas" w:cs="Consolas"/>
-          <w:i/>
-          <w:sz w:val="20"/>
-          <w:szCs w:val="20"/>
-        </w:rPr>
-        <w:t>A</w:t>
-      </w:r>
-      <w:r>
-        <w:rPr>
-          <w:rFonts w:ascii="Consolas" w:hAnsi="Consolas" w:cs="Consolas"/>
-          <w:i/>
-          <w:sz w:val="20"/>
-          <w:szCs w:val="20"/>
-        </w:rPr>
-        <w:t>uthorization</w:t>
-      </w:r>
-      <w:r>
-        <w:rPr>
-          <w:rFonts w:ascii="Arial" w:hAnsi="Arial" w:cs="Arial"/>
-          <w:i/>
-          <w:sz w:val="20"/>
-          <w:szCs w:val="20"/>
-        </w:rPr>
-        <w:t> </w:t>
-      </w:r>
-      <w:r>
-        <w:rPr>
-          <w:rFonts w:ascii="Consolas" w:hAnsi="Consolas" w:cs="Consolas"/>
-          <w:i/>
-          <w:sz w:val="20"/>
-          <w:szCs w:val="20"/>
-        </w:rPr>
-        <w:t>Response</w:t>
-      </w:r>
-      <w:r>
-        <w:rPr>
-          <w:rFonts w:ascii="Arial" w:hAnsi="Arial" w:cs="Arial"/>
-          <w:i/>
-          <w:sz w:val="20"/>
-          <w:szCs w:val="20"/>
-        </w:rPr>
-        <w:t xml:space="preserve"> object, created by a </w:t>
-      </w:r>
-      <w:r>
-        <w:rPr>
-          <w:rFonts w:ascii="Arial" w:hAnsi="Arial" w:cs="Arial"/>
-          <w:i/>
-          <w:sz w:val="20"/>
-          <w:szCs w:val="20"/>
-        </w:rPr>
-        <w:t>Payment</w:t>
-      </w:r>
-      <w:r>
-        <w:rPr>
-          <w:rFonts w:ascii="Arial" w:hAnsi="Arial" w:cs="Arial"/>
-          <w:i/>
-          <w:sz w:val="20"/>
-          <w:szCs w:val="20"/>
-        </w:rPr>
-        <w:t> W</w:t>
-      </w:r>
-      <w:r>
-        <w:rPr>
-          <w:rFonts w:ascii="Arial" w:hAnsi="Arial" w:cs="Arial"/>
-          <w:i/>
-          <w:sz w:val="20"/>
-          <w:szCs w:val="20"/>
-        </w:rPr>
-        <w:t xml:space="preserve">allet under the </w:t>
-      </w:r>
-      <w:r>
-        <w:rPr>
-          <w:rFonts w:ascii="Arial" w:hAnsi="Arial" w:cs="Arial"/>
-          <w:i/>
-          <w:sz w:val="20"/>
-          <w:szCs w:val="20"/>
-        </w:rPr>
-        <w:t>P</w:t>
-      </w:r>
-      <w:r>
-        <w:rPr>
-          <w:rFonts w:ascii="Arial" w:hAnsi="Arial" w:cs="Arial"/>
-          <w:i/>
-          <w:sz w:val="20"/>
-          <w:szCs w:val="20"/>
-        </w:rPr>
-        <w:t>ayer’s supervision.</w:t>
-      </w:r>
-      <w:r>
-        <w:rPr>
-          <w:rFonts w:ascii="Arial" w:hAnsi="Arial" w:cs="Arial"/>
-          <w:i/>
-          <w:sz w:val="20"/>
-          <w:szCs w:val="20"/>
-        </w:rPr>
-        <w:br/>
-      </w:r>
-      <w:r>
-        <w:rPr>
-          <w:rFonts w:ascii="Arial" w:hAnsi="Arial" w:cs="Arial"/>
-          <w:i/>
-          <w:sz w:val="20"/>
-          <w:szCs w:val="20"/>
-        </w:rPr>
-        <w:t>The</w:t>
-      </w:r>
-      <w:r>
-        <w:rPr>
-          <w:rFonts w:ascii="Arial" w:hAnsi="Arial" w:cs="Arial"/>
-          <w:i/>
-          <w:sz w:val="20"/>
-          <w:szCs w:val="20"/>
-        </w:rPr>
-        <w:t xml:space="preserve"> </w:t>
-      </w:r>
-      <w:r>
-        <w:rPr>
-          <w:rFonts w:ascii="Consolas" w:hAnsi="Consolas" w:cs="Consolas"/>
-          <w:i/>
-          <w:sz w:val="20"/>
-          <w:szCs w:val="20"/>
-        </w:rPr>
-        <w:t>Authorization</w:t>
-      </w:r>
-      <w:r>
-        <w:rPr>
-          <w:rFonts w:ascii="Arial" w:hAnsi="Arial" w:cs="Arial"/>
-          <w:i/>
-          <w:sz w:val="20"/>
-          <w:szCs w:val="20"/>
-        </w:rPr>
-        <w:t> </w:t>
-      </w:r>
-      <w:r>
-        <w:rPr>
-          <w:rFonts w:ascii="Consolas" w:hAnsi="Consolas" w:cs="Consolas"/>
-          <w:i/>
-          <w:sz w:val="20"/>
-          <w:szCs w:val="20"/>
-        </w:rPr>
-        <w:t>Response</w:t>
-      </w:r>
-      <w:r>
-        <w:rPr>
-          <w:rFonts w:ascii="Arial" w:hAnsi="Arial" w:cs="Arial"/>
-          <w:i/>
-          <w:sz w:val="20"/>
-          <w:szCs w:val="20"/>
-        </w:rPr>
-        <w:t xml:space="preserve"> object contains both the</w:t>
-      </w:r>
-      <w:r>
-        <w:rPr>
-          <w:rFonts w:ascii="Arial" w:hAnsi="Arial" w:cs="Arial"/>
-          <w:i/>
-          <w:sz w:val="20"/>
-          <w:szCs w:val="20"/>
-        </w:rPr>
-        <w:t xml:space="preserve"> core of the</w:t>
-      </w:r>
-      <w:r>
-        <w:rPr>
-          <w:rFonts w:ascii="Arial" w:hAnsi="Arial" w:cs="Arial"/>
-          <w:i/>
-          <w:sz w:val="20"/>
-          <w:szCs w:val="20"/>
-        </w:rPr>
-        <w:t xml:space="preserve"> original </w:t>
-      </w:r>
-      <w:r>
-        <w:rPr>
-          <w:rFonts w:ascii="Consolas" w:hAnsi="Consolas" w:cs="Consolas"/>
-          <w:i/>
-          <w:sz w:val="20"/>
-          <w:szCs w:val="20"/>
-        </w:rPr>
-        <w:t>Authorization</w:t>
-      </w:r>
-      <w:r>
-        <w:rPr>
-          <w:rFonts w:ascii="Arial" w:hAnsi="Arial" w:cs="Arial"/>
-          <w:i/>
-          <w:sz w:val="20"/>
-          <w:szCs w:val="20"/>
-        </w:rPr>
-        <w:t xml:space="preserve"> </w:t>
-      </w:r>
-      <w:r>
-        <w:rPr>
-          <w:rFonts w:ascii="Consolas" w:hAnsi="Consolas" w:cs="Consolas"/>
-          <w:i/>
-          <w:sz w:val="20"/>
-          <w:szCs w:val="20"/>
-        </w:rPr>
-        <w:t>Request</w:t>
-      </w:r>
-      <w:r>
-        <w:rPr>
-          <w:rFonts w:ascii="Arial" w:hAnsi="Arial" w:cs="Arial"/>
-          <w:i/>
-          <w:sz w:val="20"/>
-          <w:szCs w:val="20"/>
-        </w:rPr>
-        <w:t xml:space="preserve"> object </w:t>
-      </w:r>
-      <w:r>
-        <w:rPr>
-          <w:rFonts w:ascii="Arial" w:hAnsi="Arial" w:cs="Arial"/>
-          <w:i/>
-          <w:sz w:val="20"/>
-          <w:szCs w:val="20"/>
-        </w:rPr>
-        <w:t xml:space="preserve">as well as data associated with a by the </w:t>
-      </w:r>
-      <w:r>
-        <w:rPr>
-          <w:rFonts w:ascii="Arial" w:hAnsi="Arial" w:cs="Arial"/>
-          <w:i/>
-          <w:sz w:val="20"/>
-          <w:szCs w:val="20"/>
-        </w:rPr>
-        <w:t>P</w:t>
-      </w:r>
-      <w:r>
-        <w:rPr>
-          <w:rFonts w:ascii="Arial" w:hAnsi="Arial" w:cs="Arial"/>
-          <w:i/>
-          <w:sz w:val="20"/>
-          <w:szCs w:val="20"/>
-        </w:rPr>
-        <w:t xml:space="preserve">ayer selected </w:t>
-      </w:r>
-      <w:r>
-        <w:rPr>
-          <w:rFonts w:ascii="Arial" w:hAnsi="Arial" w:cs="Arial"/>
-          <w:i/>
-          <w:sz w:val="20"/>
-          <w:szCs w:val="20"/>
-        </w:rPr>
-        <w:t>P</w:t>
-      </w:r>
-      <w:r>
-        <w:rPr>
-          <w:rFonts w:ascii="Arial" w:hAnsi="Arial" w:cs="Arial"/>
-          <w:i/>
-          <w:sz w:val="20"/>
-          <w:szCs w:val="20"/>
-        </w:rPr>
-        <w:t xml:space="preserve">ayment </w:t>
-      </w:r>
-      <w:r>
-        <w:rPr>
-          <w:rFonts w:ascii="Arial" w:hAnsi="Arial" w:cs="Arial"/>
-          <w:i/>
-          <w:sz w:val="20"/>
-          <w:szCs w:val="20"/>
-        </w:rPr>
-        <w:t>C</w:t>
-      </w:r>
-      <w:r>
-        <w:rPr>
-          <w:rFonts w:ascii="Arial" w:hAnsi="Arial" w:cs="Arial"/>
-          <w:i/>
-          <w:sz w:val="20"/>
-          <w:szCs w:val="20"/>
-        </w:rPr>
-        <w:t xml:space="preserve">redential. </w:t>
-      </w:r>
-      <w:r>
-        <w:rPr>
-          <w:rFonts w:ascii="Arial" w:hAnsi="Arial" w:cs="Arial"/>
-          <w:i/>
-          <w:sz w:val="20"/>
-          <w:szCs w:val="20"/>
-        </w:rPr>
-        <w:t xml:space="preserve"> </w:t>
-      </w:r>
-      <w:r>
-        <w:rPr>
-          <w:rFonts w:ascii="Arial" w:hAnsi="Arial" w:cs="Arial"/>
-          <w:i/>
-          <w:sz w:val="20"/>
-          <w:szCs w:val="20"/>
-        </w:rPr>
-        <w:t xml:space="preserve">All returned data </w:t>
-      </w:r>
-      <w:r>
-        <w:rPr>
-          <w:rFonts w:ascii="Arial" w:hAnsi="Arial" w:cs="Arial"/>
-          <w:i/>
-          <w:sz w:val="20"/>
-          <w:szCs w:val="20"/>
-        </w:rPr>
-        <w:t xml:space="preserve">is signed by a single signature associated with the selected </w:t>
-      </w:r>
-      <w:r>
-        <w:rPr>
-          <w:rFonts w:ascii="Arial" w:hAnsi="Arial" w:cs="Arial"/>
-          <w:i/>
-          <w:sz w:val="20"/>
-          <w:szCs w:val="20"/>
-        </w:rPr>
-        <w:t>Payment Credential.  For privacy reasons</w:t>
-      </w:r>
-      <w:r>
-        <w:rPr>
-          <w:rFonts w:ascii="Arial" w:hAnsi="Arial" w:cs="Arial"/>
-          <w:i/>
-          <w:sz w:val="20"/>
-          <w:szCs w:val="20"/>
-        </w:rPr>
-        <w:t xml:space="preserve"> (with respect the </w:t>
-      </w:r>
-      <w:r>
-        <w:rPr>
-          <w:rFonts w:ascii="Arial" w:hAnsi="Arial" w:cs="Arial"/>
-          <w:i/>
-          <w:sz w:val="20"/>
-          <w:szCs w:val="20"/>
-        </w:rPr>
-        <w:t>Payee</w:t>
-      </w:r>
-      <w:r>
-        <w:rPr>
-          <w:rFonts w:ascii="Arial" w:hAnsi="Arial" w:cs="Arial"/>
-          <w:i/>
-          <w:sz w:val="20"/>
-          <w:szCs w:val="20"/>
-        </w:rPr>
-        <w:t>)</w:t>
-      </w:r>
-      <w:r>
-        <w:rPr>
-          <w:rFonts w:ascii="Arial" w:hAnsi="Arial" w:cs="Arial"/>
-          <w:i/>
-          <w:sz w:val="20"/>
-          <w:szCs w:val="20"/>
-        </w:rPr>
-        <w:t xml:space="preserve">, </w:t>
-      </w:r>
-      <w:r>
-        <w:rPr>
-          <w:rFonts w:ascii="Arial" w:hAnsi="Arial" w:cs="Arial"/>
-          <w:i/>
-          <w:sz w:val="20"/>
-          <w:szCs w:val="20"/>
-        </w:rPr>
-        <w:t>P</w:t>
-      </w:r>
-      <w:r>
-        <w:rPr>
-          <w:rFonts w:ascii="Arial" w:hAnsi="Arial" w:cs="Arial"/>
-          <w:i/>
-          <w:sz w:val="20"/>
-          <w:szCs w:val="20"/>
-        </w:rPr>
-        <w:t xml:space="preserve">ayer-specific data is encrypted, while the </w:t>
-      </w:r>
-      <w:r>
-        <w:rPr>
-          <w:rFonts w:ascii="Consolas" w:hAnsi="Consolas" w:cs="Consolas"/>
-          <w:i/>
-          <w:sz w:val="20"/>
-          <w:szCs w:val="20"/>
-        </w:rPr>
-        <w:t>Authorization</w:t>
-      </w:r>
-      <w:r>
-        <w:rPr>
-          <w:rFonts w:ascii="Arial" w:hAnsi="Arial" w:cs="Arial"/>
-          <w:i/>
-          <w:sz w:val="20"/>
-          <w:szCs w:val="20"/>
-        </w:rPr>
-        <w:t xml:space="preserve"> </w:t>
-      </w:r>
-      <w:r>
-        <w:rPr>
-          <w:rFonts w:ascii="Consolas" w:hAnsi="Consolas" w:cs="Consolas"/>
-          <w:i/>
-          <w:sz w:val="20"/>
-          <w:szCs w:val="20"/>
-        </w:rPr>
-        <w:t>Request</w:t>
-      </w:r>
-      <w:r>
-        <w:rPr>
-          <w:rFonts w:ascii="Arial" w:hAnsi="Arial" w:cs="Arial"/>
-          <w:i/>
-          <w:sz w:val="20"/>
-          <w:szCs w:val="20"/>
-        </w:rPr>
-        <w:t xml:space="preserve"> as well as non-personal data related to the Payment Network associated with the selected Payment Credential, is </w:t>
-      </w:r>
-      <w:r>
-        <w:rPr>
-          <w:rFonts w:ascii="Arial" w:hAnsi="Arial" w:cs="Arial"/>
-          <w:i/>
-          <w:sz w:val="20"/>
-          <w:szCs w:val="20"/>
-        </w:rPr>
-        <w:t>provided</w:t>
-      </w:r>
-      <w:r>
-        <w:rPr>
-          <w:rFonts w:ascii="Arial" w:hAnsi="Arial" w:cs="Arial"/>
-          <w:i/>
-          <w:sz w:val="20"/>
-          <w:szCs w:val="20"/>
-        </w:rPr>
-        <w:t xml:space="preserve"> in clear to </w:t>
-      </w:r>
-      <w:r>
-        <w:rPr>
-          <w:rFonts w:ascii="Arial" w:hAnsi="Arial" w:cs="Arial"/>
-          <w:i/>
-          <w:sz w:val="20"/>
-          <w:szCs w:val="20"/>
-        </w:rPr>
-        <w:t xml:space="preserve">enable </w:t>
-      </w:r>
-      <w:r>
-        <w:rPr>
-          <w:rFonts w:ascii="Arial" w:hAnsi="Arial" w:cs="Arial"/>
-          <w:i/>
-          <w:sz w:val="20"/>
-          <w:szCs w:val="20"/>
-        </w:rPr>
-        <w:t xml:space="preserve">forwarding </w:t>
-      </w:r>
-      <w:r>
-        <w:rPr>
-          <w:rFonts w:ascii="Arial" w:hAnsi="Arial" w:cs="Arial"/>
-          <w:i/>
-          <w:sz w:val="20"/>
-          <w:szCs w:val="20"/>
-        </w:rPr>
-        <w:t>and processing</w:t>
-      </w:r>
-      <w:r>
-        <w:rPr>
-          <w:rFonts w:ascii="Arial" w:hAnsi="Arial" w:cs="Arial"/>
-          <w:i/>
-          <w:sz w:val="20"/>
-          <w:szCs w:val="20"/>
-        </w:rPr>
         <w:t>.</w:t>
-      </w:r>
-      <w:r>
-        <w:rPr>
-          <w:rFonts w:ascii="Arial" w:hAnsi="Arial" w:cs="Arial"/>
-          <w:i/>
-          <w:sz w:val="20"/>
-          <w:szCs w:val="20"/>
-        </w:rPr>
-        <w:t xml:space="preserve">  The </w:t>
-      </w:r>
-      <w:r>
-        <w:rPr>
-          <w:rFonts w:ascii="Arial" w:hAnsi="Arial" w:cs="Arial"/>
-          <w:i/>
-          <w:sz w:val="20"/>
-          <w:szCs w:val="20"/>
-        </w:rPr>
-        <w:t xml:space="preserve">described </w:t>
-      </w:r>
-      <w:r>
-        <w:rPr>
-          <w:rFonts w:ascii="Arial" w:hAnsi="Arial" w:cs="Arial"/>
-          <w:i/>
-          <w:sz w:val="20"/>
-          <w:szCs w:val="20"/>
-        </w:rPr>
-        <w:t xml:space="preserve">scheme </w:t>
-      </w:r>
-      <w:r>
-        <w:rPr>
-          <w:rFonts w:ascii="Arial" w:hAnsi="Arial" w:cs="Arial"/>
-          <w:i/>
-          <w:sz w:val="20"/>
-          <w:szCs w:val="20"/>
-        </w:rPr>
-        <w:t xml:space="preserve">builds </w:t>
-      </w:r>
-      <w:r>
-        <w:rPr>
-          <w:rFonts w:ascii="Arial" w:hAnsi="Arial" w:cs="Arial"/>
-          <w:i/>
-          <w:sz w:val="20"/>
-          <w:szCs w:val="20"/>
-        </w:rPr>
-        <w:t>on</w:t>
-      </w:r>
-      <w:r>
-        <w:rPr>
-          <w:rFonts w:ascii="Arial" w:hAnsi="Arial" w:cs="Arial"/>
-          <w:i/>
-          <w:sz w:val="20"/>
-          <w:szCs w:val="20"/>
-        </w:rPr>
-        <w:t xml:space="preserve"> CBOR.</w:t>
       </w:r>
     </w:p>
     <w:p>
@@ -2960,6 +3067,25 @@
                                 <w:sz w:val="20"/>
                                 <w:szCs w:val="20"/>
                               </w:rPr>
+                              <w:t xml:space="preserve">  </w:t>
+                            </w:r>
+                            <w:r>
+                              <w:rPr>
+                                <w:rFonts w:ascii="Consolas" w:hAnsi="Consolas" w:cs="Consolas"/>
+                                <w:noProof/>
+                                <w:color w:val="E36C0A" w:themeColor="accent6" w:themeShade="BF"/>
+                                <w:sz w:val="20"/>
+                                <w:szCs w:val="20"/>
+                              </w:rPr>
+                              <w:t># PII</w:t>
+                            </w:r>
+                            <w:r>
+                              <w:rPr>
+                                <w:rFonts w:ascii="Consolas" w:hAnsi="Consolas" w:cs="Consolas"/>
+                                <w:noProof/>
+                                <w:sz w:val="20"/>
+                                <w:szCs w:val="20"/>
+                              </w:rPr>
                               <w:br/>
                               <w:t>  "unencryptedData": {</w:t>
                             </w:r>
@@ -3110,7 +3236,11 @@
           </mc:Choice>
           <mc:Fallback>
             <w:pict>
-              <v:shape w14:anchorId="1A8AE043" id="_x0000_s1029" type="#_x0000_t202" style="width:507pt;height:24.15pt;visibility:visible;mso-wrap-style:square;mso-left-percent:-10001;mso-top-percent:-10001;mso-position-horizontal:absolute;mso-position-horizontal-relative:char;mso-position-vertical:absolute;mso-position-vertical-relative:line;mso-left-percent:-10001;mso-top-percent:-10001;v-text-anchor:top" o:gfxdata="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" fillcolor="#f7f7f7" strokeweight=".5pt">
+              <v:shapetype w14:anchorId="1A8AE043" id="_x0000_t202" coordsize="21600,21600" o:spt="202" path="m,l,21600r21600,l21600,xe">
+                <v:stroke joinstyle="miter"/>
+                <v:path gradientshapeok="t" o:connecttype="rect"/>
+              </v:shapetype>
+              <v:shape id="_x0000_s1029" type="#_x0000_t202" style="width:507pt;height:24.15pt;visibility:visible;mso-wrap-style:square;mso-left-percent:-10001;mso-top-percent:-10001;mso-position-horizontal:absolute;mso-position-horizontal-relative:char;mso-position-vertical:absolute;mso-position-vertical-relative:line;mso-left-percent:-10001;mso-top-percent:-10001;v-text-anchor:top" o:gfxdata="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" fillcolor="#f7f7f7" strokeweight=".5pt">
                 <v:shadow on="t" color="black" opacity="26214f" origin="-.5,-.5" offset=".74836mm,.74836mm"/>
                 <v:textbox style="mso-fit-shape-to-text:t">
                   <w:txbxContent>
@@ -3142,6 +3272,25 @@
                         </w:rPr>
                         <w:br/>
                         <w:t>  "accountId": "FR7630002111110020050014382",</w:t>
+                      </w:r>
+                      <w:r>
+                        <w:rPr>
+                          <w:rFonts w:ascii="Consolas" w:hAnsi="Consolas" w:cs="Consolas"/>
+                          <w:noProof/>
+                          <w:sz w:val="20"/>
+                          <w:szCs w:val="20"/>
+                        </w:rPr>
+                        <w:t xml:space="preserve">  </w:t>
+                      </w:r>
+                      <w:r>
+                        <w:rPr>
+                          <w:rFonts w:ascii="Consolas" w:hAnsi="Consolas" w:cs="Consolas"/>
+                          <w:noProof/>
+                          <w:color w:val="E36C0A" w:themeColor="accent6" w:themeShade="BF"/>
+                          <w:sz w:val="20"/>
+                          <w:szCs w:val="20"/>
+                        </w:rPr>
+                        <w:t># PII</w:t>
                       </w:r>
                       <w:r>
                         <w:rPr>
@@ -3572,6 +3721,51 @@
           <w:szCs w:val="20"/>
         </w:rPr>
         <w:t>.</w:t>
+      </w:r>
+    </w:p>
+    <w:p>
+      <w:pPr>
+        <w:spacing w:afterLines="60" w:after="144"/>
+        <w:rPr>
+          <w:rFonts w:ascii="Arial" w:hAnsi="Arial" w:cs="Arial"/>
+          <w:sz w:val="20"/>
+          <w:szCs w:val="20"/>
+        </w:rPr>
+      </w:pPr>
+    </w:p>
+    <w:p>
+      <w:pPr>
+        <w:spacing w:afterLines="60" w:after="144"/>
+        <w:rPr>
+          <w:rFonts w:ascii="Arial" w:hAnsi="Arial" w:cs="Arial"/>
+          <w:sz w:val="20"/>
+          <w:szCs w:val="20"/>
+        </w:rPr>
+      </w:pPr>
+      <w:r>
+        <w:rPr>
+          <w:rFonts w:ascii="Arial" w:hAnsi="Arial" w:cs="Arial"/>
+          <w:sz w:val="20"/>
+          <w:szCs w:val="20"/>
+        </w:rPr>
+        <w:t xml:space="preserve">Although </w:t>
+      </w:r>
+      <w:r>
+        <w:rPr>
+          <w:rFonts w:ascii="Consolas" w:hAnsi="Consolas" w:cs="Consolas"/>
+          <w:noProof/>
+          <w:sz w:val="20"/>
+          <w:szCs w:val="20"/>
+        </w:rPr>
+        <w:t>"mybank.com"</w:t>
+      </w:r>
+      <w:r>
+        <w:rPr>
+          <w:rFonts w:ascii="Arial" w:hAnsi="Arial" w:cs="Arial"/>
+          <w:sz w:val="20"/>
+          <w:szCs w:val="20"/>
+        </w:rPr>
+        <w:t xml:space="preserve"> provides information about the bank of the Payee, this design considers such information as non-personal.</w:t>
       </w:r>
     </w:p>
     <w:p>
@@ -3823,6 +4017,25 @@
                                 <w:sz w:val="20"/>
                                 <w:szCs w:val="20"/>
                               </w:rPr>
+                              <w:t xml:space="preserve">  </w:t>
+                            </w:r>
+                            <w:r>
+                              <w:rPr>
+                                <w:rFonts w:ascii="Consolas" w:hAnsi="Consolas" w:cs="Consolas"/>
+                                <w:noProof/>
+                                <w:color w:val="E36C0A" w:themeColor="accent6" w:themeShade="BF"/>
+                                <w:sz w:val="20"/>
+                                <w:szCs w:val="20"/>
+                              </w:rPr>
+                              <w:t># PII</w:t>
+                            </w:r>
+                            <w:r>
+                              <w:rPr>
+                                <w:rFonts w:ascii="Consolas" w:hAnsi="Consolas" w:cs="Consolas"/>
+                                <w:noProof/>
+                                <w:sz w:val="20"/>
+                                <w:szCs w:val="20"/>
+                              </w:rPr>
                               <w:br/>
                               <w:t>  "unencryptedData": {</w:t>
                             </w:r>
@@ -4001,6 +4214,35 @@
                               </w:rPr>
                               <w:br/>
                               <w:t>    4: {</w:t>
+                            </w:r>
+                            <w:r>
+                              <w:rPr>
+                                <w:rFonts w:ascii="Consolas" w:hAnsi="Consolas" w:cs="Consolas"/>
+                                <w:noProof/>
+                                <w:sz w:val="20"/>
+                                <w:szCs w:val="20"/>
+                              </w:rPr>
+                              <w:t xml:space="preserve">   </w:t>
+                            </w:r>
+                            <w:r>
+                              <w:rPr>
+                                <w:rFonts w:ascii="Consolas" w:hAnsi="Consolas" w:cs="Consolas"/>
+                                <w:noProof/>
+                                <w:color w:val="E36C0A" w:themeColor="accent6" w:themeShade="BF"/>
+                                <w:sz w:val="20"/>
+                                <w:szCs w:val="20"/>
+                              </w:rPr>
+                              <w:t># PII</w:t>
+                            </w:r>
+                            <w:r>
+                              <w:rPr>
+                                <w:rFonts w:ascii="Consolas" w:hAnsi="Consolas" w:cs="Consolas"/>
+                                <w:noProof/>
+                                <w:color w:val="E36C0A" w:themeColor="accent6" w:themeShade="BF"/>
+                                <w:sz w:val="20"/>
+                                <w:szCs w:val="20"/>
+                              </w:rPr>
+                              <w:t xml:space="preserve"> (static user-specfic key)</w:t>
                             </w:r>
                             <w:r>
                               <w:rPr>
@@ -4177,6 +4419,25 @@
                           <w:sz w:val="20"/>
                           <w:szCs w:val="20"/>
                         </w:rPr>
+                        <w:t xml:space="preserve">  </w:t>
+                      </w:r>
+                      <w:r>
+                        <w:rPr>
+                          <w:rFonts w:ascii="Consolas" w:hAnsi="Consolas" w:cs="Consolas"/>
+                          <w:noProof/>
+                          <w:color w:val="E36C0A" w:themeColor="accent6" w:themeShade="BF"/>
+                          <w:sz w:val="20"/>
+                          <w:szCs w:val="20"/>
+                        </w:rPr>
+                        <w:t># PII</w:t>
+                      </w:r>
+                      <w:r>
+                        <w:rPr>
+                          <w:rFonts w:ascii="Consolas" w:hAnsi="Consolas" w:cs="Consolas"/>
+                          <w:noProof/>
+                          <w:sz w:val="20"/>
+                          <w:szCs w:val="20"/>
+                        </w:rPr>
                         <w:br/>
                         <w:t>  "unencryptedData": {</w:t>
                       </w:r>
@@ -4355,6 +4616,35 @@
                         </w:rPr>
                         <w:br/>
                         <w:t>    4: {</w:t>
+                      </w:r>
+                      <w:r>
+                        <w:rPr>
+                          <w:rFonts w:ascii="Consolas" w:hAnsi="Consolas" w:cs="Consolas"/>
+                          <w:noProof/>
+                          <w:sz w:val="20"/>
+                          <w:szCs w:val="20"/>
+                        </w:rPr>
+                        <w:t xml:space="preserve">   </w:t>
+                      </w:r>
+                      <w:r>
+                        <w:rPr>
+                          <w:rFonts w:ascii="Consolas" w:hAnsi="Consolas" w:cs="Consolas"/>
+                          <w:noProof/>
+                          <w:color w:val="E36C0A" w:themeColor="accent6" w:themeShade="BF"/>
+                          <w:sz w:val="20"/>
+                          <w:szCs w:val="20"/>
+                        </w:rPr>
+                        <w:t># PII</w:t>
+                      </w:r>
+                      <w:r>
+                        <w:rPr>
+                          <w:rFonts w:ascii="Consolas" w:hAnsi="Consolas" w:cs="Consolas"/>
+                          <w:noProof/>
+                          <w:color w:val="E36C0A" w:themeColor="accent6" w:themeShade="BF"/>
+                          <w:sz w:val="20"/>
+                          <w:szCs w:val="20"/>
+                        </w:rPr>
+                        <w:t xml:space="preserve"> (static user-specfic key)</w:t>
                       </w:r>
                       <w:r>
                         <w:rPr>
@@ -5767,6 +6057,34 @@
                                 <w:sz w:val="20"/>
                                 <w:szCs w:val="20"/>
                               </w:rPr>
+                              <w:t xml:space="preserve"> </w:t>
+                            </w:r>
+                            <w:r>
+                              <w:rPr>
+                                <w:rFonts w:ascii="Consolas" w:hAnsi="Consolas" w:cs="Consolas"/>
+                                <w:noProof/>
+                                <w:sz w:val="20"/>
+                                <w:szCs w:val="20"/>
+                              </w:rPr>
+                              <w:t xml:space="preserve"> </w:t>
+                            </w:r>
+                            <w:r>
+                              <w:rPr>
+                                <w:rFonts w:ascii="Consolas" w:hAnsi="Consolas" w:cs="Consolas"/>
+                                <w:noProof/>
+                                <w:color w:val="E36C0A" w:themeColor="accent6" w:themeShade="BF"/>
+                                <w:sz w:val="20"/>
+                                <w:szCs w:val="20"/>
+                              </w:rPr>
+                              <w:t># PII</w:t>
+                            </w:r>
+                            <w:r>
+                              <w:rPr>
+                                <w:rFonts w:ascii="Consolas" w:hAnsi="Consolas" w:cs="Consolas"/>
+                                <w:noProof/>
+                                <w:sz w:val="20"/>
+                                <w:szCs w:val="20"/>
+                              </w:rPr>
                               <w:br/>
                               <w:t>  "authorizationSignature": {</w:t>
                             </w:r>
@@ -5789,6 +6107,44 @@
                               </w:rPr>
                               <w:br/>
                               <w:t>    4: {</w:t>
+                            </w:r>
+                            <w:r>
+                              <w:rPr>
+                                <w:rFonts w:ascii="Consolas" w:hAnsi="Consolas" w:cs="Consolas"/>
+                                <w:noProof/>
+                                <w:sz w:val="20"/>
+                                <w:szCs w:val="20"/>
+                              </w:rPr>
+                              <w:t xml:space="preserve">  </w:t>
+                            </w:r>
+                            <w:r>
+                              <w:rPr>
+                                <w:rFonts w:ascii="Consolas" w:hAnsi="Consolas" w:cs="Consolas"/>
+                                <w:noProof/>
+                                <w:sz w:val="20"/>
+                                <w:szCs w:val="20"/>
+                              </w:rPr>
+                              <w:t xml:space="preserve"> </w:t>
+                            </w:r>
+                            <w:r>
+                              <w:rPr>
+                                <w:rFonts w:ascii="Consolas" w:hAnsi="Consolas" w:cs="Consolas"/>
+                                <w:noProof/>
+                                <w:color w:val="E36C0A" w:themeColor="accent6" w:themeShade="BF"/>
+                                <w:sz w:val="20"/>
+                                <w:szCs w:val="20"/>
+                              </w:rPr>
+                              <w:t># PII</w:t>
+                            </w:r>
+                            <w:r>
+                              <w:rPr>
+                                <w:rFonts w:ascii="Consolas" w:hAnsi="Consolas" w:cs="Consolas"/>
+                                <w:noProof/>
+                                <w:color w:val="E36C0A" w:themeColor="accent6" w:themeShade="BF"/>
+                                <w:sz w:val="20"/>
+                                <w:szCs w:val="20"/>
+                              </w:rPr>
+                              <w:t xml:space="preserve"> (static user-specific key)</w:t>
                             </w:r>
                             <w:r>
                               <w:rPr>
@@ -5965,6 +6321,34 @@
                           <w:sz w:val="20"/>
                           <w:szCs w:val="20"/>
                         </w:rPr>
+                        <w:t xml:space="preserve"> </w:t>
+                      </w:r>
+                      <w:r>
+                        <w:rPr>
+                          <w:rFonts w:ascii="Consolas" w:hAnsi="Consolas" w:cs="Consolas"/>
+                          <w:noProof/>
+                          <w:sz w:val="20"/>
+                          <w:szCs w:val="20"/>
+                        </w:rPr>
+                        <w:t xml:space="preserve"> </w:t>
+                      </w:r>
+                      <w:r>
+                        <w:rPr>
+                          <w:rFonts w:ascii="Consolas" w:hAnsi="Consolas" w:cs="Consolas"/>
+                          <w:noProof/>
+                          <w:color w:val="E36C0A" w:themeColor="accent6" w:themeShade="BF"/>
+                          <w:sz w:val="20"/>
+                          <w:szCs w:val="20"/>
+                        </w:rPr>
+                        <w:t># PII</w:t>
+                      </w:r>
+                      <w:r>
+                        <w:rPr>
+                          <w:rFonts w:ascii="Consolas" w:hAnsi="Consolas" w:cs="Consolas"/>
+                          <w:noProof/>
+                          <w:sz w:val="20"/>
+                          <w:szCs w:val="20"/>
+                        </w:rPr>
                         <w:br/>
                         <w:t>  "authorizationSignature": {</w:t>
                       </w:r>
@@ -5987,6 +6371,44 @@
                         </w:rPr>
                         <w:br/>
                         <w:t>    4: {</w:t>
+                      </w:r>
+                      <w:r>
+                        <w:rPr>
+                          <w:rFonts w:ascii="Consolas" w:hAnsi="Consolas" w:cs="Consolas"/>
+                          <w:noProof/>
+                          <w:sz w:val="20"/>
+                          <w:szCs w:val="20"/>
+                        </w:rPr>
+                        <w:t xml:space="preserve">  </w:t>
+                      </w:r>
+                      <w:r>
+                        <w:rPr>
+                          <w:rFonts w:ascii="Consolas" w:hAnsi="Consolas" w:cs="Consolas"/>
+                          <w:noProof/>
+                          <w:sz w:val="20"/>
+                          <w:szCs w:val="20"/>
+                        </w:rPr>
+                        <w:t xml:space="preserve"> </w:t>
+                      </w:r>
+                      <w:r>
+                        <w:rPr>
+                          <w:rFonts w:ascii="Consolas" w:hAnsi="Consolas" w:cs="Consolas"/>
+                          <w:noProof/>
+                          <w:color w:val="E36C0A" w:themeColor="accent6" w:themeShade="BF"/>
+                          <w:sz w:val="20"/>
+                          <w:szCs w:val="20"/>
+                        </w:rPr>
+                        <w:t># PII</w:t>
+                      </w:r>
+                      <w:r>
+                        <w:rPr>
+                          <w:rFonts w:ascii="Consolas" w:hAnsi="Consolas" w:cs="Consolas"/>
+                          <w:noProof/>
+                          <w:color w:val="E36C0A" w:themeColor="accent6" w:themeShade="BF"/>
+                          <w:sz w:val="20"/>
+                          <w:szCs w:val="20"/>
+                        </w:rPr>
+                        <w:t xml:space="preserve"> (static user-specific key)</w:t>
                       </w:r>
                       <w:r>
                         <w:rPr>
@@ -6948,6 +7370,45 @@
                                 <w:sz w:val="20"/>
                                 <w:szCs w:val="20"/>
                               </w:rPr>
+                              <w:t xml:space="preserve">   </w:t>
+                            </w:r>
+                            <w:r>
+                              <w:rPr>
+                                <w:rFonts w:ascii="Consolas" w:hAnsi="Consolas" w:cs="Consolas"/>
+                                <w:noProof/>
+                                <w:color w:val="E36C0A" w:themeColor="accent6" w:themeShade="BF"/>
+                                <w:sz w:val="20"/>
+                                <w:szCs w:val="20"/>
+                              </w:rPr>
+                              <w:t xml:space="preserve"># Shared </w:t>
+                            </w:r>
+                            <w:r>
+                              <w:rPr>
+                                <w:rFonts w:ascii="Consolas" w:hAnsi="Consolas" w:cs="Consolas"/>
+                                <w:noProof/>
+                                <w:color w:val="E36C0A" w:themeColor="accent6" w:themeShade="BF"/>
+                                <w:sz w:val="20"/>
+                                <w:szCs w:val="20"/>
+                              </w:rPr>
+                              <w:t>static DH</w:t>
+                            </w:r>
+                            <w:r>
+                              <w:rPr>
+                                <w:rFonts w:ascii="Consolas" w:hAnsi="Consolas" w:cs="Consolas"/>
+                                <w:noProof/>
+                                <w:color w:val="E36C0A" w:themeColor="accent6" w:themeShade="BF"/>
+                                <w:sz w:val="20"/>
+                                <w:szCs w:val="20"/>
+                              </w:rPr>
+                              <w:t xml:space="preserve"> key – Not PII</w:t>
+                            </w:r>
+                            <w:r>
+                              <w:rPr>
+                                <w:rFonts w:ascii="Consolas" w:hAnsi="Consolas" w:cs="Consolas"/>
+                                <w:noProof/>
+                                <w:sz w:val="20"/>
+                                <w:szCs w:val="20"/>
+                              </w:rPr>
                               <w:br/>
                               <w:t>      1: 2,</w:t>
                             </w:r>
@@ -7000,6 +7461,65 @@
                               </w:rPr>
                               <w:br/>
                               <w:t>    7: {</w:t>
+                            </w:r>
+                            <w:r>
+                              <w:rPr>
+                                <w:rFonts w:ascii="Consolas" w:hAnsi="Consolas" w:cs="Consolas"/>
+                                <w:noProof/>
+                                <w:sz w:val="20"/>
+                                <w:szCs w:val="20"/>
+                              </w:rPr>
+                              <w:t xml:space="preserve">   </w:t>
+                            </w:r>
+                            <w:r>
+                              <w:rPr>
+                                <w:rFonts w:ascii="Consolas" w:hAnsi="Consolas" w:cs="Consolas"/>
+                                <w:noProof/>
+                                <w:color w:val="E36C0A" w:themeColor="accent6" w:themeShade="BF"/>
+                                <w:sz w:val="20"/>
+                                <w:szCs w:val="20"/>
+                              </w:rPr>
+                              <w:t xml:space="preserve"># </w:t>
+                            </w:r>
+                            <w:r>
+                              <w:rPr>
+                                <w:rFonts w:ascii="Consolas" w:hAnsi="Consolas" w:cs="Consolas"/>
+                                <w:noProof/>
+                                <w:color w:val="E36C0A" w:themeColor="accent6" w:themeShade="BF"/>
+                                <w:sz w:val="20"/>
+                                <w:szCs w:val="20"/>
+                              </w:rPr>
+                              <w:t>Ephemeral</w:t>
+                            </w:r>
+                            <w:r>
+                              <w:rPr>
+                                <w:rFonts w:ascii="Consolas" w:hAnsi="Consolas" w:cs="Consolas"/>
+                                <w:noProof/>
+                                <w:color w:val="E36C0A" w:themeColor="accent6" w:themeShade="BF"/>
+                                <w:sz w:val="20"/>
+                                <w:szCs w:val="20"/>
+                              </w:rPr>
+                              <w:t xml:space="preserve"> </w:t>
+                            </w:r>
+                            <w:r>
+                              <w:rPr>
+                                <w:rFonts w:ascii="Consolas" w:hAnsi="Consolas" w:cs="Consolas"/>
+                                <w:noProof/>
+                                <w:color w:val="E36C0A" w:themeColor="accent6" w:themeShade="BF"/>
+                                <w:sz w:val="20"/>
+                                <w:szCs w:val="20"/>
+                              </w:rPr>
+                              <w:t xml:space="preserve">DH </w:t>
+                            </w:r>
+                            <w:r>
+                              <w:rPr>
+                                <w:rFonts w:ascii="Consolas" w:hAnsi="Consolas" w:cs="Consolas"/>
+                                <w:noProof/>
+                                <w:color w:val="E36C0A" w:themeColor="accent6" w:themeShade="BF"/>
+                                <w:sz w:val="20"/>
+                                <w:szCs w:val="20"/>
+                              </w:rPr>
+                              <w:t>key – Not PII</w:t>
                             </w:r>
                             <w:r>
                               <w:rPr>
@@ -7182,7 +7702,11 @@
           </mc:Choice>
           <mc:Fallback>
             <w:pict>
-              <v:shape w14:anchorId="59B5279C" id="_x0000_s1033" type="#_x0000_t202" style="width:507pt;height:24.15pt;visibility:visible;mso-wrap-style:square;mso-left-percent:-10001;mso-top-percent:-10001;mso-position-horizontal:absolute;mso-position-horizontal-relative:char;mso-position-vertical:absolute;mso-position-vertical-relative:line;mso-left-percent:-10001;mso-top-percent:-10001;v-text-anchor:top" o:gfxdata="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" fillcolor="#f7f7f7" strokeweight=".5pt">
+              <v:shapetype w14:anchorId="59B5279C" id="_x0000_t202" coordsize="21600,21600" o:spt="202" path="m,l,21600r21600,l21600,xe">
+                <v:stroke joinstyle="miter"/>
+                <v:path gradientshapeok="t" o:connecttype="rect"/>
+              </v:shapetype>
+              <v:shape id="_x0000_s1033" type="#_x0000_t202" style="width:507pt;height:24.15pt;visibility:visible;mso-wrap-style:square;mso-left-percent:-10001;mso-top-percent:-10001;mso-position-horizontal:absolute;mso-position-horizontal-relative:char;mso-position-vertical:absolute;mso-position-vertical-relative:line;mso-left-percent:-10001;mso-top-percent:-10001;v-text-anchor:top" o:gfxdata="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" fillcolor="#f7f7f7" strokeweight=".5pt">
                 <v:shadow on="t" color="black" opacity="26214f" origin="-.5,-.5" offset=".74836mm,.74836mm"/>
                 <v:textbox style="mso-fit-shape-to-text:t">
                   <w:txbxContent>
@@ -7646,6 +8170,45 @@
                           <w:sz w:val="20"/>
                           <w:szCs w:val="20"/>
                         </w:rPr>
+                        <w:t xml:space="preserve">   </w:t>
+                      </w:r>
+                      <w:r>
+                        <w:rPr>
+                          <w:rFonts w:ascii="Consolas" w:hAnsi="Consolas" w:cs="Consolas"/>
+                          <w:noProof/>
+                          <w:color w:val="E36C0A" w:themeColor="accent6" w:themeShade="BF"/>
+                          <w:sz w:val="20"/>
+                          <w:szCs w:val="20"/>
+                        </w:rPr>
+                        <w:t xml:space="preserve"># Shared </w:t>
+                      </w:r>
+                      <w:r>
+                        <w:rPr>
+                          <w:rFonts w:ascii="Consolas" w:hAnsi="Consolas" w:cs="Consolas"/>
+                          <w:noProof/>
+                          <w:color w:val="E36C0A" w:themeColor="accent6" w:themeShade="BF"/>
+                          <w:sz w:val="20"/>
+                          <w:szCs w:val="20"/>
+                        </w:rPr>
+                        <w:t>static DH</w:t>
+                      </w:r>
+                      <w:r>
+                        <w:rPr>
+                          <w:rFonts w:ascii="Consolas" w:hAnsi="Consolas" w:cs="Consolas"/>
+                          <w:noProof/>
+                          <w:color w:val="E36C0A" w:themeColor="accent6" w:themeShade="BF"/>
+                          <w:sz w:val="20"/>
+                          <w:szCs w:val="20"/>
+                        </w:rPr>
+                        <w:t xml:space="preserve"> key – Not PII</w:t>
+                      </w:r>
+                      <w:r>
+                        <w:rPr>
+                          <w:rFonts w:ascii="Consolas" w:hAnsi="Consolas" w:cs="Consolas"/>
+                          <w:noProof/>
+                          <w:sz w:val="20"/>
+                          <w:szCs w:val="20"/>
+                        </w:rPr>
                         <w:br/>
                         <w:t>      1: 2,</w:t>
                       </w:r>
@@ -7698,6 +8261,65 @@
                         </w:rPr>
                         <w:br/>
                         <w:t>    7: {</w:t>
+                      </w:r>
+                      <w:r>
+                        <w:rPr>
+                          <w:rFonts w:ascii="Consolas" w:hAnsi="Consolas" w:cs="Consolas"/>
+                          <w:noProof/>
+                          <w:sz w:val="20"/>
+                          <w:szCs w:val="20"/>
+                        </w:rPr>
+                        <w:t xml:space="preserve">   </w:t>
+                      </w:r>
+                      <w:r>
+                        <w:rPr>
+                          <w:rFonts w:ascii="Consolas" w:hAnsi="Consolas" w:cs="Consolas"/>
+                          <w:noProof/>
+                          <w:color w:val="E36C0A" w:themeColor="accent6" w:themeShade="BF"/>
+                          <w:sz w:val="20"/>
+                          <w:szCs w:val="20"/>
+                        </w:rPr>
+                        <w:t xml:space="preserve"># </w:t>
+                      </w:r>
+                      <w:r>
+                        <w:rPr>
+                          <w:rFonts w:ascii="Consolas" w:hAnsi="Consolas" w:cs="Consolas"/>
+                          <w:noProof/>
+                          <w:color w:val="E36C0A" w:themeColor="accent6" w:themeShade="BF"/>
+                          <w:sz w:val="20"/>
+                          <w:szCs w:val="20"/>
+                        </w:rPr>
+                        <w:t>Ephemeral</w:t>
+                      </w:r>
+                      <w:r>
+                        <w:rPr>
+                          <w:rFonts w:ascii="Consolas" w:hAnsi="Consolas" w:cs="Consolas"/>
+                          <w:noProof/>
+                          <w:color w:val="E36C0A" w:themeColor="accent6" w:themeShade="BF"/>
+                          <w:sz w:val="20"/>
+                          <w:szCs w:val="20"/>
+                        </w:rPr>
+                        <w:t xml:space="preserve"> </w:t>
+                      </w:r>
+                      <w:r>
+                        <w:rPr>
+                          <w:rFonts w:ascii="Consolas" w:hAnsi="Consolas" w:cs="Consolas"/>
+                          <w:noProof/>
+                          <w:color w:val="E36C0A" w:themeColor="accent6" w:themeShade="BF"/>
+                          <w:sz w:val="20"/>
+                          <w:szCs w:val="20"/>
+                        </w:rPr>
+                        <w:t xml:space="preserve">DH </w:t>
+                      </w:r>
+                      <w:r>
+                        <w:rPr>
+                          <w:rFonts w:ascii="Consolas" w:hAnsi="Consolas" w:cs="Consolas"/>
+                          <w:noProof/>
+                          <w:color w:val="E36C0A" w:themeColor="accent6" w:themeShade="BF"/>
+                          <w:sz w:val="20"/>
+                          <w:szCs w:val="20"/>
+                        </w:rPr>
+                        <w:t>key – Not PII</w:t>
                       </w:r>
                       <w:r>
                         <w:rPr>
@@ -10980,7 +11602,7 @@
 </file>
 
 <file path=word/endnotes.xml><?xml version="1.0" encoding="utf-8"?>
-<w:endnotes xmlns:wpc="http://schemas.microsoft.com/office/word/2010/wordprocessingCanvas" xmlns:cx="http://schemas.microsoft.com/office/drawing/2014/chartex" xmlns:cx1="http://schemas.microsoft.com/office/drawing/2015/9/8/chartex" xmlns:cx2="http://schemas.microsoft.com/office/drawing/2015/10/21/chartex" xmlns:cx3="http://schemas.microsoft.com/office/drawing/2016/5/9/chartex" xmlns:cx4="http://schemas.microsoft.com/office/drawing/2016/5/10/chartex" xmlns:cx5="http://schemas.microsoft.com/office/drawing/2016/5/11/chartex" xmlns:cx6="http://schemas.microsoft.com/office/drawing/2016/5/12/chartex" xmlns:cx7="http://schemas.microsoft.com/office/drawing/2016/5/13/chartex" xmlns:cx8="http://schemas.microsoft.com/office/drawing/2016/5/14/chartex" xmlns:mc="http://schemas.openxmlformats.org/markup-compatibility/2006" xmlns:aink="http://schemas.microsoft.com/office/drawing/2016/ink" xmlns:am3d="http://schemas.microsoft.com/office/drawing/2017/model3d" xmlns:o="urn:schemas-microsoft-com:office:office" xmlns:oel="http://schemas.microsoft.com/office/2019/extlst" xmlns:r="http://schemas.openxmlformats.org/officeDocument/2006/relationships" xmlns:m="http://schemas.openxmlformats.org/officeDocument/2006/math" xmlns:v="urn:schemas-microsoft-com:vml" xmlns:wp14="http://schemas.microsoft.com/office/word/2010/wordprocessingDrawing" xmlns:wp="http://schemas.openxmlformats.org/drawingml/2006/wordprocessingDrawing" xmlns:w10="urn:schemas-microsoft-com:office:word" xmlns:w="http://schemas.openxmlformats.org/wordprocessingml/2006/main" xmlns:w14="http://schemas.microsoft.com/office/word/2010/wordml" xmlns:w15="http://schemas.microsoft.com/office/word/2012/wordml" xmlns:w16cex="http://schemas.microsoft.com/office/word/2018/wordml/cex" xmlns:w16cid="http://schemas.microsoft.com/office/word/2016/wordml/cid" xmlns:w16="http://schemas.microsoft.com/office/word/2018/wordml" xmlns:w16du="http://schemas.microsoft.com/office/word/2023/wordml/word16du" xmlns:w16sdtdh="http://schemas.microsoft.com/office/word/2020/wordml/sdtdatahash" xmlns:w16se="http://schemas.microsoft.com/office/word/2015/wordml/symex" xmlns:wpg="http://schemas.microsoft.com/office/word/2010/wordprocessingGroup" xmlns:wpi="http://schemas.microsoft.com/office/word/2010/wordprocessingInk" xmlns:wne="http://schemas.microsoft.com/office/word/2006/wordml" xmlns:wps="http://schemas.microsoft.com/office/word/2010/wordprocessingShape" mc:Ignorable="w14 w15 w16se w16cid w16 w16cex w16sdtdh w16du wp14">
+<w:endnotes xmlns:wpc="http://schemas.microsoft.com/office/word/2010/wordprocessingCanvas" xmlns:cx="http://schemas.microsoft.com/office/drawing/2014/chartex" xmlns:cx1="http://schemas.microsoft.com/office/drawing/2015/9/8/chartex" xmlns:cx2="http://schemas.microsoft.com/office/drawing/2015/10/21/chartex" xmlns:cx3="http://schemas.microsoft.com/office/drawing/2016/5/9/chartex" xmlns:cx4="http://schemas.microsoft.com/office/drawing/2016/5/10/chartex" xmlns:cx5="http://schemas.microsoft.com/office/drawing/2016/5/11/chartex" xmlns:cx6="http://schemas.microsoft.com/office/drawing/2016/5/12/chartex" xmlns:cx7="http://schemas.microsoft.com/office/drawing/2016/5/13/chartex" xmlns:cx8="http://schemas.microsoft.com/office/drawing/2016/5/14/chartex" xmlns:mc="http://schemas.openxmlformats.org/markup-compatibility/2006" xmlns:aink="http://schemas.microsoft.com/office/drawing/2016/ink" xmlns:am3d="http://schemas.microsoft.com/office/drawing/2017/model3d" xmlns:o="urn:schemas-microsoft-com:office:office" xmlns:oel="http://schemas.microsoft.com/office/2019/extlst" xmlns:r="http://schemas.openxmlformats.org/officeDocument/2006/relationships" xmlns:m="http://schemas.openxmlformats.org/officeDocument/2006/math" xmlns:v="urn:schemas-microsoft-com:vml" xmlns:wp14="http://schemas.microsoft.com/office/word/2010/wordprocessingDrawing" xmlns:wp="http://schemas.openxmlformats.org/drawingml/2006/wordprocessingDrawing" xmlns:w10="urn:schemas-microsoft-com:office:word" xmlns:w="http://schemas.openxmlformats.org/wordprocessingml/2006/main" xmlns:w14="http://schemas.microsoft.com/office/word/2010/wordml" xmlns:w15="http://schemas.microsoft.com/office/word/2012/wordml" xmlns:w16cex="http://schemas.microsoft.com/office/word/2018/wordml/cex" xmlns:w16cid="http://schemas.microsoft.com/office/word/2016/wordml/cid" xmlns:w16="http://schemas.microsoft.com/office/word/2018/wordml" xmlns:w16du="http://schemas.microsoft.com/office/word/2023/wordml/word16du" xmlns:w16sdtdh="http://schemas.microsoft.com/office/word/2020/wordml/sdtdatahash" xmlns:w16sdtfl="http://schemas.microsoft.com/office/word/2024/wordml/sdtformatlock" xmlns:w16se="http://schemas.microsoft.com/office/word/2015/wordml/symex" xmlns:wpg="http://schemas.microsoft.com/office/word/2010/wordprocessingGroup" xmlns:wpi="http://schemas.microsoft.com/office/word/2010/wordprocessingInk" xmlns:wne="http://schemas.microsoft.com/office/word/2006/wordml" xmlns:wps="http://schemas.microsoft.com/office/word/2010/wordprocessingShape" mc:Ignorable="w14 w15 w16se w16cid w16 w16cex w16sdtdh w16sdtfl w16du wp14">
   <w:endnote w:type="separator" w:id="-1">
     <w:p>
       <w:pPr>
@@ -11005,7 +11627,7 @@
 </file>
 
 <file path=word/footer1.xml><?xml version="1.0" encoding="utf-8"?>
-<w:ftr xmlns:wpc="http://schemas.microsoft.com/office/word/2010/wordprocessingCanvas" xmlns:cx="http://schemas.microsoft.com/office/drawing/2014/chartex" xmlns:cx1="http://schemas.microsoft.com/office/drawing/2015/9/8/chartex" xmlns:cx2="http://schemas.microsoft.com/office/drawing/2015/10/21/chartex" xmlns:cx3="http://schemas.microsoft.com/office/drawing/2016/5/9/chartex" xmlns:cx4="http://schemas.microsoft.com/office/drawing/2016/5/10/chartex" xmlns:cx5="http://schemas.microsoft.com/office/drawing/2016/5/11/chartex" xmlns:cx6="http://schemas.microsoft.com/office/drawing/2016/5/12/chartex" xmlns:cx7="http://schemas.microsoft.com/office/drawing/2016/5/13/chartex" xmlns:cx8="http://schemas.microsoft.com/office/drawing/2016/5/14/chartex" xmlns:mc="http://schemas.openxmlformats.org/markup-compatibility/2006" xmlns:aink="http://schemas.microsoft.com/office/drawing/2016/ink" xmlns:am3d="http://schemas.microsoft.com/office/drawing/2017/model3d" xmlns:o="urn:schemas-microsoft-com:office:office" xmlns:oel="http://schemas.microsoft.com/office/2019/extlst" xmlns:r="http://schemas.openxmlformats.org/officeDocument/2006/relationships" xmlns:m="http://schemas.openxmlformats.org/officeDocument/2006/math" xmlns:v="urn:schemas-microsoft-com:vml" xmlns:wp14="http://schemas.microsoft.com/office/word/2010/wordprocessingDrawing" xmlns:wp="http://schemas.openxmlformats.org/drawingml/2006/wordprocessingDrawing" xmlns:w10="urn:schemas-microsoft-com:office:word" xmlns:w="http://schemas.openxmlformats.org/wordprocessingml/2006/main" xmlns:w14="http://schemas.microsoft.com/office/word/2010/wordml" xmlns:w15="http://schemas.microsoft.com/office/word/2012/wordml" xmlns:w16cex="http://schemas.microsoft.com/office/word/2018/wordml/cex" xmlns:w16cid="http://schemas.microsoft.com/office/word/2016/wordml/cid" xmlns:w16="http://schemas.microsoft.com/office/word/2018/wordml" xmlns:w16du="http://schemas.microsoft.com/office/word/2023/wordml/word16du" xmlns:w16sdtdh="http://schemas.microsoft.com/office/word/2020/wordml/sdtdatahash" xmlns:w16se="http://schemas.microsoft.com/office/word/2015/wordml/symex" xmlns:wpg="http://schemas.microsoft.com/office/word/2010/wordprocessingGroup" xmlns:wpi="http://schemas.microsoft.com/office/word/2010/wordprocessingInk" xmlns:wne="http://schemas.microsoft.com/office/word/2006/wordml" xmlns:wps="http://schemas.microsoft.com/office/word/2010/wordprocessingShape" mc:Ignorable="w14 w15 w16se w16cid w16 w16cex w16sdtdh w16du wp14">
+<w:ftr xmlns:wpc="http://schemas.microsoft.com/office/word/2010/wordprocessingCanvas" xmlns:cx="http://schemas.microsoft.com/office/drawing/2014/chartex" xmlns:cx1="http://schemas.microsoft.com/office/drawing/2015/9/8/chartex" xmlns:cx2="http://schemas.microsoft.com/office/drawing/2015/10/21/chartex" xmlns:cx3="http://schemas.microsoft.com/office/drawing/2016/5/9/chartex" xmlns:cx4="http://schemas.microsoft.com/office/drawing/2016/5/10/chartex" xmlns:cx5="http://schemas.microsoft.com/office/drawing/2016/5/11/chartex" xmlns:cx6="http://schemas.microsoft.com/office/drawing/2016/5/12/chartex" xmlns:cx7="http://schemas.microsoft.com/office/drawing/2016/5/13/chartex" xmlns:cx8="http://schemas.microsoft.com/office/drawing/2016/5/14/chartex" xmlns:mc="http://schemas.openxmlformats.org/markup-compatibility/2006" xmlns:aink="http://schemas.microsoft.com/office/drawing/2016/ink" xmlns:am3d="http://schemas.microsoft.com/office/drawing/2017/model3d" xmlns:o="urn:schemas-microsoft-com:office:office" xmlns:oel="http://schemas.microsoft.com/office/2019/extlst" xmlns:r="http://schemas.openxmlformats.org/officeDocument/2006/relationships" xmlns:m="http://schemas.openxmlformats.org/officeDocument/2006/math" xmlns:v="urn:schemas-microsoft-com:vml" xmlns:wp14="http://schemas.microsoft.com/office/word/2010/wordprocessingDrawing" xmlns:wp="http://schemas.openxmlformats.org/drawingml/2006/wordprocessingDrawing" xmlns:w10="urn:schemas-microsoft-com:office:word" xmlns:w="http://schemas.openxmlformats.org/wordprocessingml/2006/main" xmlns:w14="http://schemas.microsoft.com/office/word/2010/wordml" xmlns:w15="http://schemas.microsoft.com/office/word/2012/wordml" xmlns:w16cex="http://schemas.microsoft.com/office/word/2018/wordml/cex" xmlns:w16cid="http://schemas.microsoft.com/office/word/2016/wordml/cid" xmlns:w16="http://schemas.microsoft.com/office/word/2018/wordml" xmlns:w16du="http://schemas.microsoft.com/office/word/2023/wordml/word16du" xmlns:w16sdtdh="http://schemas.microsoft.com/office/word/2020/wordml/sdtdatahash" xmlns:w16sdtfl="http://schemas.microsoft.com/office/word/2024/wordml/sdtformatlock" xmlns:w16se="http://schemas.microsoft.com/office/word/2015/wordml/symex" xmlns:wpg="http://schemas.microsoft.com/office/word/2010/wordprocessingGroup" xmlns:wpi="http://schemas.microsoft.com/office/word/2010/wordprocessingInk" xmlns:wne="http://schemas.microsoft.com/office/word/2006/wordml" xmlns:wps="http://schemas.microsoft.com/office/word/2010/wordprocessingShape" mc:Ignorable="w14 w15 w16se w16cid w16 w16cex w16sdtdh w16sdtfl w16du wp14">
   <w:p>
     <w:pPr>
       <w:pStyle w:val="Footer"/>
@@ -11211,7 +11833,7 @@
 </file>
 
 <file path=word/footnotes.xml><?xml version="1.0" encoding="utf-8"?>
-<w:footnotes xmlns:wpc="http://schemas.microsoft.com/office/word/2010/wordprocessingCanvas" xmlns:cx="http://schemas.microsoft.com/office/drawing/2014/chartex" xmlns:cx1="http://schemas.microsoft.com/office/drawing/2015/9/8/chartex" xmlns:cx2="http://schemas.microsoft.com/office/drawing/2015/10/21/chartex" xmlns:cx3="http://schemas.microsoft.com/office/drawing/2016/5/9/chartex" xmlns:cx4="http://schemas.microsoft.com/office/drawing/2016/5/10/chartex" xmlns:cx5="http://schemas.microsoft.com/office/drawing/2016/5/11/chartex" xmlns:cx6="http://schemas.microsoft.com/office/drawing/2016/5/12/chartex" xmlns:cx7="http://schemas.microsoft.com/office/drawing/2016/5/13/chartex" xmlns:cx8="http://schemas.microsoft.com/office/drawing/2016/5/14/chartex" xmlns:mc="http://schemas.openxmlformats.org/markup-compatibility/2006" xmlns:aink="http://schemas.microsoft.com/office/drawing/2016/ink" xmlns:am3d="http://schemas.microsoft.com/office/drawing/2017/model3d" xmlns:o="urn:schemas-microsoft-com:office:office" xmlns:oel="http://schemas.microsoft.com/office/2019/extlst" xmlns:r="http://schemas.openxmlformats.org/officeDocument/2006/relationships" xmlns:m="http://schemas.openxmlformats.org/officeDocument/2006/math" xmlns:v="urn:schemas-microsoft-com:vml" xmlns:wp14="http://schemas.microsoft.com/office/word/2010/wordprocessingDrawing" xmlns:wp="http://schemas.openxmlformats.org/drawingml/2006/wordprocessingDrawing" xmlns:w10="urn:schemas-microsoft-com:office:word" xmlns:w="http://schemas.openxmlformats.org/wordprocessingml/2006/main" xmlns:w14="http://schemas.microsoft.com/office/word/2010/wordml" xmlns:w15="http://schemas.microsoft.com/office/word/2012/wordml" xmlns:w16cex="http://schemas.microsoft.com/office/word/2018/wordml/cex" xmlns:w16cid="http://schemas.microsoft.com/office/word/2016/wordml/cid" xmlns:w16="http://schemas.microsoft.com/office/word/2018/wordml" xmlns:w16du="http://schemas.microsoft.com/office/word/2023/wordml/word16du" xmlns:w16sdtdh="http://schemas.microsoft.com/office/word/2020/wordml/sdtdatahash" xmlns:w16se="http://schemas.microsoft.com/office/word/2015/wordml/symex" xmlns:wpg="http://schemas.microsoft.com/office/word/2010/wordprocessingGroup" xmlns:wpi="http://schemas.microsoft.com/office/word/2010/wordprocessingInk" xmlns:wne="http://schemas.microsoft.com/office/word/2006/wordml" xmlns:wps="http://schemas.microsoft.com/office/word/2010/wordprocessingShape" mc:Ignorable="w14 w15 w16se w16cid w16 w16cex w16sdtdh w16du wp14">
+<w:footnotes xmlns:wpc="http://schemas.microsoft.com/office/word/2010/wordprocessingCanvas" xmlns:cx="http://schemas.microsoft.com/office/drawing/2014/chartex" xmlns:cx1="http://schemas.microsoft.com/office/drawing/2015/9/8/chartex" xmlns:cx2="http://schemas.microsoft.com/office/drawing/2015/10/21/chartex" xmlns:cx3="http://schemas.microsoft.com/office/drawing/2016/5/9/chartex" xmlns:cx4="http://schemas.microsoft.com/office/drawing/2016/5/10/chartex" xmlns:cx5="http://schemas.microsoft.com/office/drawing/2016/5/11/chartex" xmlns:cx6="http://schemas.microsoft.com/office/drawing/2016/5/12/chartex" xmlns:cx7="http://schemas.microsoft.com/office/drawing/2016/5/13/chartex" xmlns:cx8="http://schemas.microsoft.com/office/drawing/2016/5/14/chartex" xmlns:mc="http://schemas.openxmlformats.org/markup-compatibility/2006" xmlns:aink="http://schemas.microsoft.com/office/drawing/2016/ink" xmlns:am3d="http://schemas.microsoft.com/office/drawing/2017/model3d" xmlns:o="urn:schemas-microsoft-com:office:office" xmlns:oel="http://schemas.microsoft.com/office/2019/extlst" xmlns:r="http://schemas.openxmlformats.org/officeDocument/2006/relationships" xmlns:m="http://schemas.openxmlformats.org/officeDocument/2006/math" xmlns:v="urn:schemas-microsoft-com:vml" xmlns:wp14="http://schemas.microsoft.com/office/word/2010/wordprocessingDrawing" xmlns:wp="http://schemas.openxmlformats.org/drawingml/2006/wordprocessingDrawing" xmlns:w10="urn:schemas-microsoft-com:office:word" xmlns:w="http://schemas.openxmlformats.org/wordprocessingml/2006/main" xmlns:w14="http://schemas.microsoft.com/office/word/2010/wordml" xmlns:w15="http://schemas.microsoft.com/office/word/2012/wordml" xmlns:w16cex="http://schemas.microsoft.com/office/word/2018/wordml/cex" xmlns:w16cid="http://schemas.microsoft.com/office/word/2016/wordml/cid" xmlns:w16="http://schemas.microsoft.com/office/word/2018/wordml" xmlns:w16du="http://schemas.microsoft.com/office/word/2023/wordml/word16du" xmlns:w16sdtdh="http://schemas.microsoft.com/office/word/2020/wordml/sdtdatahash" xmlns:w16sdtfl="http://schemas.microsoft.com/office/word/2024/wordml/sdtformatlock" xmlns:w16se="http://schemas.microsoft.com/office/word/2015/wordml/symex" xmlns:wpg="http://schemas.microsoft.com/office/word/2010/wordprocessingGroup" xmlns:wpi="http://schemas.microsoft.com/office/word/2010/wordprocessingInk" xmlns:wne="http://schemas.microsoft.com/office/word/2006/wordml" xmlns:wps="http://schemas.microsoft.com/office/word/2010/wordprocessingShape" mc:Ignorable="w14 w15 w16se w16cid w16 w16cex w16sdtdh w16sdtfl w16du wp14">
   <w:footnote w:type="separator" w:id="-1">
     <w:p>
       <w:pPr>
@@ -11236,7 +11858,7 @@
 </file>
 
 <file path=word/numbering.xml><?xml version="1.0" encoding="utf-8"?>
-<w:numbering xmlns:wpc="http://schemas.microsoft.com/office/word/2010/wordprocessingCanvas" xmlns:cx="http://schemas.microsoft.com/office/drawing/2014/chartex" xmlns:cx1="http://schemas.microsoft.com/office/drawing/2015/9/8/chartex" xmlns:cx2="http://schemas.microsoft.com/office/drawing/2015/10/21/chartex" xmlns:cx3="http://schemas.microsoft.com/office/drawing/2016/5/9/chartex" xmlns:cx4="http://schemas.microsoft.com/office/drawing/2016/5/10/chartex" xmlns:cx5="http://schemas.microsoft.com/office/drawing/2016/5/11/chartex" xmlns:cx6="http://schemas.microsoft.com/office/drawing/2016/5/12/chartex" xmlns:cx7="http://schemas.microsoft.com/office/drawing/2016/5/13/chartex" xmlns:cx8="http://schemas.microsoft.com/office/drawing/2016/5/14/chartex" xmlns:mc="http://schemas.openxmlformats.org/markup-compatibility/2006" xmlns:aink="http://schemas.microsoft.com/office/drawing/2016/ink" xmlns:am3d="http://schemas.microsoft.com/office/drawing/2017/model3d" xmlns:o="urn:schemas-microsoft-com:office:office" xmlns:oel="http://schemas.microsoft.com/office/2019/extlst" xmlns:r="http://schemas.openxmlformats.org/officeDocument/2006/relationships" xmlns:m="http://schemas.openxmlformats.org/officeDocument/2006/math" xmlns:v="urn:schemas-microsoft-com:vml" xmlns:wp14="http://schemas.microsoft.com/office/word/2010/wordprocessingDrawing" xmlns:wp="http://schemas.openxmlformats.org/drawingml/2006/wordprocessingDrawing" xmlns:w10="urn:schemas-microsoft-com:office:word" xmlns:w="http://schemas.openxmlformats.org/wordprocessingml/2006/main" xmlns:w14="http://schemas.microsoft.com/office/word/2010/wordml" xmlns:w15="http://schemas.microsoft.com/office/word/2012/wordml" xmlns:w16cex="http://schemas.microsoft.com/office/word/2018/wordml/cex" xmlns:w16cid="http://schemas.microsoft.com/office/word/2016/wordml/cid" xmlns:w16="http://schemas.microsoft.com/office/word/2018/wordml" xmlns:w16du="http://schemas.microsoft.com/office/word/2023/wordml/word16du" xmlns:w16sdtdh="http://schemas.microsoft.com/office/word/2020/wordml/sdtdatahash" xmlns:w16se="http://schemas.microsoft.com/office/word/2015/wordml/symex" xmlns:wpg="http://schemas.microsoft.com/office/word/2010/wordprocessingGroup" xmlns:wpi="http://schemas.microsoft.com/office/word/2010/wordprocessingInk" xmlns:wne="http://schemas.microsoft.com/office/word/2006/wordml" xmlns:wps="http://schemas.microsoft.com/office/word/2010/wordprocessingShape" mc:Ignorable="w14 w15 w16se w16cid w16 w16cex w16sdtdh w16du wp14">
+<w:numbering xmlns:wpc="http://schemas.microsoft.com/office/word/2010/wordprocessingCanvas" xmlns:cx="http://schemas.microsoft.com/office/drawing/2014/chartex" xmlns:cx1="http://schemas.microsoft.com/office/drawing/2015/9/8/chartex" xmlns:cx2="http://schemas.microsoft.com/office/drawing/2015/10/21/chartex" xmlns:cx3="http://schemas.microsoft.com/office/drawing/2016/5/9/chartex" xmlns:cx4="http://schemas.microsoft.com/office/drawing/2016/5/10/chartex" xmlns:cx5="http://schemas.microsoft.com/office/drawing/2016/5/11/chartex" xmlns:cx6="http://schemas.microsoft.com/office/drawing/2016/5/12/chartex" xmlns:cx7="http://schemas.microsoft.com/office/drawing/2016/5/13/chartex" xmlns:cx8="http://schemas.microsoft.com/office/drawing/2016/5/14/chartex" xmlns:mc="http://schemas.openxmlformats.org/markup-compatibility/2006" xmlns:aink="http://schemas.microsoft.com/office/drawing/2016/ink" xmlns:am3d="http://schemas.microsoft.com/office/drawing/2017/model3d" xmlns:o="urn:schemas-microsoft-com:office:office" xmlns:oel="http://schemas.microsoft.com/office/2019/extlst" xmlns:r="http://schemas.openxmlformats.org/officeDocument/2006/relationships" xmlns:m="http://schemas.openxmlformats.org/officeDocument/2006/math" xmlns:v="urn:schemas-microsoft-com:vml" xmlns:wp14="http://schemas.microsoft.com/office/word/2010/wordprocessingDrawing" xmlns:wp="http://schemas.openxmlformats.org/drawingml/2006/wordprocessingDrawing" xmlns:w10="urn:schemas-microsoft-com:office:word" xmlns:w="http://schemas.openxmlformats.org/wordprocessingml/2006/main" xmlns:w14="http://schemas.microsoft.com/office/word/2010/wordml" xmlns:w15="http://schemas.microsoft.com/office/word/2012/wordml" xmlns:w16cex="http://schemas.microsoft.com/office/word/2018/wordml/cex" xmlns:w16cid="http://schemas.microsoft.com/office/word/2016/wordml/cid" xmlns:w16="http://schemas.microsoft.com/office/word/2018/wordml" xmlns:w16du="http://schemas.microsoft.com/office/word/2023/wordml/word16du" xmlns:w16sdtdh="http://schemas.microsoft.com/office/word/2020/wordml/sdtdatahash" xmlns:w16sdtfl="http://schemas.microsoft.com/office/word/2024/wordml/sdtformatlock" xmlns:w16se="http://schemas.microsoft.com/office/word/2015/wordml/symex" xmlns:wpg="http://schemas.microsoft.com/office/word/2010/wordprocessingGroup" xmlns:wpi="http://schemas.microsoft.com/office/word/2010/wordprocessingInk" xmlns:wne="http://schemas.microsoft.com/office/word/2006/wordml" xmlns:wps="http://schemas.microsoft.com/office/word/2010/wordprocessingShape" mc:Ignorable="w14 w15 w16se w16cid w16 w16cex w16sdtdh w16sdtfl w16du wp14">
   <w:abstractNum w:abstractNumId="0" w15:restartNumberingAfterBreak="0">
     <w:nsid w:val="00FD1C8D"/>
     <w:multiLevelType w:val="hybridMultilevel"/>
@@ -13273,7 +13895,7 @@
 </file>
 
 <file path=word/styles.xml><?xml version="1.0" encoding="utf-8"?>
-<w:styles xmlns:mc="http://schemas.openxmlformats.org/markup-compatibility/2006" xmlns:r="http://schemas.openxmlformats.org/officeDocument/2006/relationships" xmlns:w="http://schemas.openxmlformats.org/wordprocessingml/2006/main" xmlns:w14="http://schemas.microsoft.com/office/word/2010/wordml" xmlns:w15="http://schemas.microsoft.com/office/word/2012/wordml" xmlns:w16cex="http://schemas.microsoft.com/office/word/2018/wordml/cex" xmlns:w16cid="http://schemas.microsoft.com/office/word/2016/wordml/cid" xmlns:w16="http://schemas.microsoft.com/office/word/2018/wordml" xmlns:w16du="http://schemas.microsoft.com/office/word/2023/wordml/word16du" xmlns:w16sdtdh="http://schemas.microsoft.com/office/word/2020/wordml/sdtdatahash" xmlns:w16se="http://schemas.microsoft.com/office/word/2015/wordml/symex" mc:Ignorable="w14 w15 w16se w16cid w16 w16cex w16sdtdh w16du">
+<w:styles xmlns:mc="http://schemas.openxmlformats.org/markup-compatibility/2006" xmlns:r="http://schemas.openxmlformats.org/officeDocument/2006/relationships" xmlns:w="http://schemas.openxmlformats.org/wordprocessingml/2006/main" xmlns:w14="http://schemas.microsoft.com/office/word/2010/wordml" xmlns:w15="http://schemas.microsoft.com/office/word/2012/wordml" xmlns:w16cex="http://schemas.microsoft.com/office/word/2018/wordml/cex" xmlns:w16cid="http://schemas.microsoft.com/office/word/2016/wordml/cid" xmlns:w16="http://schemas.microsoft.com/office/word/2018/wordml" xmlns:w16du="http://schemas.microsoft.com/office/word/2023/wordml/word16du" xmlns:w16sdtdh="http://schemas.microsoft.com/office/word/2020/wordml/sdtdatahash" xmlns:w16sdtfl="http://schemas.microsoft.com/office/word/2024/wordml/sdtformatlock" xmlns:w16se="http://schemas.microsoft.com/office/word/2015/wordml/symex" mc:Ignorable="w14 w15 w16se w16cid w16 w16cex w16sdtdh w16sdtfl w16du">
   <w:docDefaults>
     <w:rPrDefault>
       <w:rPr>
@@ -13674,6 +14296,7 @@
   <w:style w:type="character" w:default="1" w:styleId="DefaultParagraphFont">
     <w:name w:val="Default Paragraph Font"/>
     <w:uiPriority w:val="1"/>
+    <w:semiHidden/>
     <w:unhideWhenUsed/>
   </w:style>
   <w:style w:type="table" w:default="1" w:styleId="TableNormal">

</xml_diff>

<commit_message>
added "Core request" to all code examples
</commit_message>
<xml_diff>
--- a/defensive-publications/partial-encryption-full-signature.docx
+++ b/defensive-publications/partial-encryption-full-signature.docx
@@ -1863,15 +1863,141 @@
         <mc:AlternateContent>
           <mc:Choice Requires="wps">
             <w:drawing>
+              <wp:anchor distT="0" distB="0" distL="114300" distR="114300" simplePos="0" relativeHeight="251666432" behindDoc="0" locked="0" layoutInCell="1" allowOverlap="1">
+                <wp:simplePos x="0" y="0"/>
+                <wp:positionH relativeFrom="column">
+                  <wp:posOffset>2787015</wp:posOffset>
+                </wp:positionH>
+                <wp:positionV relativeFrom="paragraph">
+                  <wp:posOffset>480060</wp:posOffset>
+                </wp:positionV>
+                <wp:extent cx="1099820" cy="289560"/>
+                <wp:effectExtent l="25400" t="25400" r="104775" b="102870"/>
+                <wp:wrapNone/>
+                <wp:docPr id="28172785" name="Text Box 21"/>
+                <wp:cNvGraphicFramePr/>
+                <a:graphic xmlns:a="http://schemas.openxmlformats.org/drawingml/2006/main">
+                  <a:graphicData uri="http://schemas.microsoft.com/office/word/2010/wordprocessingShape">
+                    <wps:wsp>
+                      <wps:cNvSpPr txBox="1"/>
+                      <wps:spPr>
+                        <a:xfrm>
+                          <a:off x="0" y="0"/>
+                          <a:ext cx="1099820" cy="289560"/>
+                        </a:xfrm>
+                        <a:prstGeom prst="rect">
+                          <a:avLst/>
+                        </a:prstGeom>
+                        <a:solidFill>
+                          <a:srgbClr val="FBF8D8"/>
+                        </a:solidFill>
+                        <a:ln w="6350">
+                          <a:solidFill>
+                            <a:prstClr val="black"/>
+                          </a:solidFill>
+                        </a:ln>
+                        <a:effectLst>
+                          <a:outerShdw blurRad="50800" dist="38100" dir="2700000" algn="tl" rotWithShape="0">
+                            <a:prstClr val="black">
+                              <a:alpha val="40000"/>
+                            </a:prstClr>
+                          </a:outerShdw>
+                        </a:effectLst>
+                      </wps:spPr>
+                      <wps:txbx>
+                        <w:txbxContent>
+                          <w:p>
+                            <w:pPr>
+                              <w:spacing w:after="0"/>
+                              <w:rPr>
+                                <w:rFonts w:ascii="Arial" w:hAnsi="Arial" w:cs="Arial"/>
+                                <w:sz w:val="20"/>
+                                <w:szCs w:val="20"/>
+                              </w:rPr>
+                            </w:pPr>
+                            <w:r>
+                              <w:rPr>
+                                <w:rFonts w:ascii="Arial" w:hAnsi="Arial" w:cs="Arial"/>
+                                <w:sz w:val="20"/>
+                                <w:szCs w:val="20"/>
+                              </w:rPr>
+                              <w:t xml:space="preserve">Core request </w:t>
+                            </w:r>
+                          </w:p>
+                        </w:txbxContent>
+                      </wps:txbx>
+                      <wps:bodyPr rot="0" spcFirstLastPara="0" vertOverflow="overflow" horzOverflow="overflow" vert="horz" wrap="none" lIns="91440" tIns="45720" rIns="91440" bIns="45720" numCol="1" spcCol="0" rtlCol="0" fromWordArt="0" anchor="ctr" anchorCtr="0" forceAA="0" compatLnSpc="1">
+                        <a:prstTxWarp prst="textNoShape">
+                          <a:avLst/>
+                        </a:prstTxWarp>
+                        <a:spAutoFit/>
+                      </wps:bodyPr>
+                    </wps:wsp>
+                  </a:graphicData>
+                </a:graphic>
+                <wp14:sizeRelH relativeFrom="margin">
+                  <wp14:pctWidth>0</wp14:pctWidth>
+                </wp14:sizeRelH>
+                <wp14:sizeRelV relativeFrom="margin">
+                  <wp14:pctHeight>0</wp14:pctHeight>
+                </wp14:sizeRelV>
+              </wp:anchor>
+            </w:drawing>
+          </mc:Choice>
+          <mc:Fallback>
+            <w:pict>
+              <v:shapetype id="_x0000_t202" coordsize="21600,21600" o:spt="202" path="m,l,21600r21600,l21600,xe">
+                <v:stroke joinstyle="miter"/>
+                <v:path gradientshapeok="t" o:connecttype="rect"/>
+              </v:shapetype>
+              <v:shape id="Text Box 21" o:spid="_x0000_s1027" type="#_x0000_t202" style="position:absolute;left:0;text-align:left;margin-left:219.45pt;margin-top:37.8pt;width:86.6pt;height:22.8pt;z-index:251666432;visibility:visible;mso-wrap-style:none;mso-width-percent:0;mso-height-percent:0;mso-wrap-distance-left:9pt;mso-wrap-distance-top:0;mso-wrap-distance-right:9pt;mso-wrap-distance-bottom:0;mso-position-horizontal:absolute;mso-position-horizontal-relative:text;mso-position-vertical:absolute;mso-position-vertical-relative:text;mso-width-percent:0;mso-height-percent:0;mso-width-relative:margin;mso-height-relative:margin;v-text-anchor:middle" o:gfxdata="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" fillcolor="#fbf8d8" strokeweight=".5pt">
+                <v:shadow on="t" color="black" opacity="26214f" origin="-.5,-.5" offset=".74836mm,.74836mm"/>
+                <v:textbox style="mso-fit-shape-to-text:t">
+                  <w:txbxContent>
+                    <w:p>
+                      <w:pPr>
+                        <w:spacing w:after="0"/>
+                        <w:rPr>
+                          <w:rFonts w:ascii="Arial" w:hAnsi="Arial" w:cs="Arial"/>
+                          <w:sz w:val="20"/>
+                          <w:szCs w:val="20"/>
+                        </w:rPr>
+                      </w:pPr>
+                      <w:r>
+                        <w:rPr>
+                          <w:rFonts w:ascii="Arial" w:hAnsi="Arial" w:cs="Arial"/>
+                          <w:sz w:val="20"/>
+                          <w:szCs w:val="20"/>
+                        </w:rPr>
+                        <w:t xml:space="preserve">Core request </w:t>
+                      </w:r>
+                    </w:p>
+                  </w:txbxContent>
+                </v:textbox>
+              </v:shape>
+            </w:pict>
+          </mc:Fallback>
+        </mc:AlternateContent>
+      </w:r>
+      <w:r>
+        <w:rPr>
+          <w:rFonts w:ascii="Arial" w:hAnsi="Arial" w:cs="Arial"/>
+          <w:noProof/>
+          <w:sz w:val="20"/>
+          <w:szCs w:val="20"/>
+        </w:rPr>
+        <mc:AlternateContent>
+          <mc:Choice Requires="wps">
+            <w:drawing>
               <wp:anchor distT="0" distB="0" distL="114300" distR="114300" simplePos="0" relativeHeight="251665408" behindDoc="0" locked="0" layoutInCell="1" allowOverlap="1">
                 <wp:simplePos x="0" y="0"/>
                 <wp:positionH relativeFrom="column">
-                  <wp:posOffset>4538097</wp:posOffset>
+                  <wp:posOffset>2505607</wp:posOffset>
                 </wp:positionH>
                 <wp:positionV relativeFrom="paragraph">
-                  <wp:posOffset>198461</wp:posOffset>
+                  <wp:posOffset>190500</wp:posOffset>
                 </wp:positionV>
-                <wp:extent cx="207769" cy="832485"/>
+                <wp:extent cx="207645" cy="832485"/>
                 <wp:effectExtent l="0" t="0" r="8255" b="18415"/>
                 <wp:wrapNone/>
                 <wp:docPr id="496314121" name="Right Brace 20"/>
@@ -1883,7 +2009,7 @@
                       <wps:spPr>
                         <a:xfrm>
                           <a:off x="0" y="0"/>
-                          <a:ext cx="207769" cy="832485"/>
+                          <a:ext cx="207645" cy="832485"/>
                         </a:xfrm>
                         <a:prstGeom prst="rightBrace">
                           <a:avLst/>
@@ -1920,7 +2046,7 @@
           </mc:Choice>
           <mc:Fallback>
             <w:pict>
-              <v:shapetype w14:anchorId="7ED9C238" id="_x0000_t88" coordsize="21600,21600" o:spt="88" adj="1800,10800" path="m,qx10800@0l10800@2qy21600@11,10800@3l10800@1qy,21600e" filled="f">
+              <v:shapetype w14:anchorId="670F41FE" id="_x0000_t88" coordsize="21600,21600" o:spt="88" adj="1800,10800" path="m,qx10800@0l10800@2qy21600@11,10800@3l10800@1qy,21600e" filled="f">
                 <v:formulas>
                   <v:f eqn="val #0"/>
                   <v:f eqn="sum 21600 0 #0"/>
@@ -1941,133 +2067,7 @@
                   <v:h position="bottomRight,#1" yrange="@9,@10"/>
                 </v:handles>
               </v:shapetype>
-              <v:shape id="Right Brace 20" o:spid="_x0000_s1026" type="#_x0000_t88" style="position:absolute;margin-left:357.35pt;margin-top:15.65pt;width:16.35pt;height:65.55pt;z-index:251665408;visibility:visible;mso-wrap-style:square;mso-width-percent:0;mso-wrap-distance-left:9pt;mso-wrap-distance-top:0;mso-wrap-distance-right:9pt;mso-wrap-distance-bottom:0;mso-position-horizontal:absolute;mso-position-horizontal-relative:text;mso-position-vertical:absolute;mso-position-vertical-relative:text;mso-width-percent:0;mso-width-relative:margin;v-text-anchor:middle" o:gfxdata="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" adj="449" strokecolor="#4579b8 [3044]"/>
-            </w:pict>
-          </mc:Fallback>
-        </mc:AlternateContent>
-      </w:r>
-      <w:r>
-        <w:rPr>
-          <w:rFonts w:ascii="Arial" w:hAnsi="Arial" w:cs="Arial"/>
-          <w:noProof/>
-          <w:sz w:val="20"/>
-          <w:szCs w:val="20"/>
-        </w:rPr>
-        <mc:AlternateContent>
-          <mc:Choice Requires="wps">
-            <w:drawing>
-              <wp:anchor distT="0" distB="0" distL="114300" distR="114300" simplePos="0" relativeHeight="251666432" behindDoc="0" locked="0" layoutInCell="1" allowOverlap="1">
-                <wp:simplePos x="0" y="0"/>
-                <wp:positionH relativeFrom="column">
-                  <wp:posOffset>4820022</wp:posOffset>
-                </wp:positionH>
-                <wp:positionV relativeFrom="paragraph">
-                  <wp:posOffset>488176</wp:posOffset>
-                </wp:positionV>
-                <wp:extent cx="1100254" cy="289932"/>
-                <wp:effectExtent l="25400" t="25400" r="104775" b="102870"/>
-                <wp:wrapNone/>
-                <wp:docPr id="28172785" name="Text Box 21"/>
-                <wp:cNvGraphicFramePr/>
-                <a:graphic xmlns:a="http://schemas.openxmlformats.org/drawingml/2006/main">
-                  <a:graphicData uri="http://schemas.microsoft.com/office/word/2010/wordprocessingShape">
-                    <wps:wsp>
-                      <wps:cNvSpPr txBox="1"/>
-                      <wps:spPr>
-                        <a:xfrm>
-                          <a:off x="0" y="0"/>
-                          <a:ext cx="1100254" cy="289932"/>
-                        </a:xfrm>
-                        <a:prstGeom prst="rect">
-                          <a:avLst/>
-                        </a:prstGeom>
-                        <a:solidFill>
-                          <a:srgbClr val="FBF8D8"/>
-                        </a:solidFill>
-                        <a:ln w="6350">
-                          <a:solidFill>
-                            <a:prstClr val="black"/>
-                          </a:solidFill>
-                        </a:ln>
-                        <a:effectLst>
-                          <a:outerShdw blurRad="50800" dist="38100" dir="2700000" algn="tl" rotWithShape="0">
-                            <a:prstClr val="black">
-                              <a:alpha val="40000"/>
-                            </a:prstClr>
-                          </a:outerShdw>
-                        </a:effectLst>
-                      </wps:spPr>
-                      <wps:txbx>
-                        <w:txbxContent>
-                          <w:p>
-                            <w:pPr>
-                              <w:spacing w:after="0"/>
-                              <w:rPr>
-                                <w:rFonts w:ascii="Arial" w:hAnsi="Arial" w:cs="Arial"/>
-                                <w:sz w:val="20"/>
-                                <w:szCs w:val="20"/>
-                              </w:rPr>
-                            </w:pPr>
-                            <w:r>
-                              <w:rPr>
-                                <w:rFonts w:ascii="Arial" w:hAnsi="Arial" w:cs="Arial"/>
-                                <w:sz w:val="20"/>
-                                <w:szCs w:val="20"/>
-                              </w:rPr>
-                              <w:t xml:space="preserve">Core request </w:t>
-                            </w:r>
-                          </w:p>
-                        </w:txbxContent>
-                      </wps:txbx>
-                      <wps:bodyPr rot="0" spcFirstLastPara="0" vertOverflow="overflow" horzOverflow="overflow" vert="horz" wrap="none" lIns="91440" tIns="45720" rIns="91440" bIns="45720" numCol="1" spcCol="0" rtlCol="0" fromWordArt="0" anchor="ctr" anchorCtr="0" forceAA="0" compatLnSpc="1">
-                        <a:prstTxWarp prst="textNoShape">
-                          <a:avLst/>
-                        </a:prstTxWarp>
-                        <a:spAutoFit/>
-                      </wps:bodyPr>
-                    </wps:wsp>
-                  </a:graphicData>
-                </a:graphic>
-                <wp14:sizeRelH relativeFrom="margin">
-                  <wp14:pctWidth>0</wp14:pctWidth>
-                </wp14:sizeRelH>
-                <wp14:sizeRelV relativeFrom="margin">
-                  <wp14:pctHeight>0</wp14:pctHeight>
-                </wp14:sizeRelV>
-              </wp:anchor>
-            </w:drawing>
-          </mc:Choice>
-          <mc:Fallback>
-            <w:pict>
-              <v:shapetype id="_x0000_t202" coordsize="21600,21600" o:spt="202" path="m,l,21600r21600,l21600,xe">
-                <v:stroke joinstyle="miter"/>
-                <v:path gradientshapeok="t" o:connecttype="rect"/>
-              </v:shapetype>
-              <v:shape id="Text Box 21" o:spid="_x0000_s1027" type="#_x0000_t202" style="position:absolute;left:0;text-align:left;margin-left:379.55pt;margin-top:38.45pt;width:86.65pt;height:22.85pt;z-index:251666432;visibility:visible;mso-wrap-style:none;mso-width-percent:0;mso-height-percent:0;mso-wrap-distance-left:9pt;mso-wrap-distance-top:0;mso-wrap-distance-right:9pt;mso-wrap-distance-bottom:0;mso-position-horizontal:absolute;mso-position-horizontal-relative:text;mso-position-vertical:absolute;mso-position-vertical-relative:text;mso-width-percent:0;mso-height-percent:0;mso-width-relative:margin;mso-height-relative:margin;v-text-anchor:middle" o:gfxdata="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" fillcolor="#fbf8d8" strokeweight=".5pt">
-                <v:shadow on="t" color="black" opacity="26214f" origin="-.5,-.5" offset=".74836mm,.74836mm"/>
-                <v:textbox style="mso-fit-shape-to-text:t">
-                  <w:txbxContent>
-                    <w:p>
-                      <w:pPr>
-                        <w:spacing w:after="0"/>
-                        <w:rPr>
-                          <w:rFonts w:ascii="Arial" w:hAnsi="Arial" w:cs="Arial"/>
-                          <w:sz w:val="20"/>
-                          <w:szCs w:val="20"/>
-                        </w:rPr>
-                      </w:pPr>
-                      <w:r>
-                        <w:rPr>
-                          <w:rFonts w:ascii="Arial" w:hAnsi="Arial" w:cs="Arial"/>
-                          <w:sz w:val="20"/>
-                          <w:szCs w:val="20"/>
-                        </w:rPr>
-                        <w:t xml:space="preserve">Core request </w:t>
-                      </w:r>
-                    </w:p>
-                  </w:txbxContent>
-                </v:textbox>
-              </v:shape>
+              <v:shape id="Right Brace 20" o:spid="_x0000_s1026" type="#_x0000_t88" style="position:absolute;margin-left:197.3pt;margin-top:15pt;width:16.35pt;height:65.55pt;z-index:251665408;visibility:visible;mso-wrap-style:square;mso-width-percent:0;mso-wrap-distance-left:9pt;mso-wrap-distance-top:0;mso-wrap-distance-right:9pt;mso-wrap-distance-bottom:0;mso-position-horizontal:absolute;mso-position-horizontal-relative:text;mso-position-vertical:absolute;mso-position-vertical-relative:text;mso-width-percent:0;mso-width-relative:margin;v-text-anchor:middle" o:gfxdata="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" adj="449" strokecolor="#4579b8 [3044]"/>
             </w:pict>
           </mc:Fallback>
         </mc:AlternateContent>
@@ -2996,6 +2996,200 @@
         <mc:AlternateContent>
           <mc:Choice Requires="wps">
             <w:drawing>
+              <wp:anchor distT="0" distB="0" distL="114300" distR="114300" simplePos="0" relativeHeight="251668480" behindDoc="0" locked="0" layoutInCell="1" allowOverlap="1" wp14:anchorId="2C0030A6" wp14:editId="1E570941">
+                <wp:simplePos x="0" y="0"/>
+                <wp:positionH relativeFrom="column">
+                  <wp:posOffset>2757805</wp:posOffset>
+                </wp:positionH>
+                <wp:positionV relativeFrom="paragraph">
+                  <wp:posOffset>1235075</wp:posOffset>
+                </wp:positionV>
+                <wp:extent cx="207645" cy="832485"/>
+                <wp:effectExtent l="0" t="0" r="8255" b="18415"/>
+                <wp:wrapNone/>
+                <wp:docPr id="965593074" name="Right Brace 20"/>
+                <wp:cNvGraphicFramePr/>
+                <a:graphic xmlns:a="http://schemas.openxmlformats.org/drawingml/2006/main">
+                  <a:graphicData uri="http://schemas.microsoft.com/office/word/2010/wordprocessingShape">
+                    <wps:wsp>
+                      <wps:cNvSpPr/>
+                      <wps:spPr>
+                        <a:xfrm>
+                          <a:off x="0" y="0"/>
+                          <a:ext cx="207645" cy="832485"/>
+                        </a:xfrm>
+                        <a:prstGeom prst="rightBrace">
+                          <a:avLst/>
+                        </a:prstGeom>
+                      </wps:spPr>
+                      <wps:style>
+                        <a:lnRef idx="1">
+                          <a:schemeClr val="accent1"/>
+                        </a:lnRef>
+                        <a:fillRef idx="0">
+                          <a:schemeClr val="accent1"/>
+                        </a:fillRef>
+                        <a:effectRef idx="0">
+                          <a:schemeClr val="accent1"/>
+                        </a:effectRef>
+                        <a:fontRef idx="minor">
+                          <a:schemeClr val="tx1"/>
+                        </a:fontRef>
+                      </wps:style>
+                      <wps:bodyPr rot="0" spcFirstLastPara="0" vertOverflow="overflow" horzOverflow="overflow" vert="horz" wrap="square" lIns="91440" tIns="45720" rIns="91440" bIns="45720" numCol="1" spcCol="0" rtlCol="0" fromWordArt="0" anchor="ctr" anchorCtr="0" forceAA="0" compatLnSpc="1">
+                        <a:prstTxWarp prst="textNoShape">
+                          <a:avLst/>
+                        </a:prstTxWarp>
+                        <a:noAutofit/>
+                      </wps:bodyPr>
+                    </wps:wsp>
+                  </a:graphicData>
+                </a:graphic>
+                <wp14:sizeRelH relativeFrom="margin">
+                  <wp14:pctWidth>0</wp14:pctWidth>
+                </wp14:sizeRelH>
+              </wp:anchor>
+            </w:drawing>
+          </mc:Choice>
+          <mc:Fallback>
+            <w:pict>
+              <v:shape w14:anchorId="4BBE829C" id="Right Brace 20" o:spid="_x0000_s1026" type="#_x0000_t88" style="position:absolute;margin-left:217.15pt;margin-top:97.25pt;width:16.35pt;height:65.55pt;z-index:251668480;visibility:visible;mso-wrap-style:square;mso-width-percent:0;mso-wrap-distance-left:9pt;mso-wrap-distance-top:0;mso-wrap-distance-right:9pt;mso-wrap-distance-bottom:0;mso-position-horizontal:absolute;mso-position-horizontal-relative:text;mso-position-vertical:absolute;mso-position-vertical-relative:text;mso-width-percent:0;mso-width-relative:margin;v-text-anchor:middle" o:gfxdata="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" adj="449" strokecolor="#4579b8 [3044]"/>
+            </w:pict>
+          </mc:Fallback>
+        </mc:AlternateContent>
+      </w:r>
+      <w:r>
+        <w:rPr>
+          <w:rFonts w:ascii="Arial" w:hAnsi="Arial" w:cs="Arial"/>
+          <w:noProof/>
+          <w:sz w:val="20"/>
+          <w:szCs w:val="20"/>
+        </w:rPr>
+        <mc:AlternateContent>
+          <mc:Choice Requires="wps">
+            <w:drawing>
+              <wp:anchor distT="0" distB="0" distL="114300" distR="114300" simplePos="0" relativeHeight="251669504" behindDoc="0" locked="0" layoutInCell="1" allowOverlap="1" wp14:anchorId="123D5EED" wp14:editId="576F6D4F">
+                <wp:simplePos x="0" y="0"/>
+                <wp:positionH relativeFrom="column">
+                  <wp:posOffset>3039745</wp:posOffset>
+                </wp:positionH>
+                <wp:positionV relativeFrom="paragraph">
+                  <wp:posOffset>1527707</wp:posOffset>
+                </wp:positionV>
+                <wp:extent cx="1099820" cy="289560"/>
+                <wp:effectExtent l="25400" t="25400" r="104775" b="102870"/>
+                <wp:wrapNone/>
+                <wp:docPr id="1209079516" name="Text Box 21"/>
+                <wp:cNvGraphicFramePr/>
+                <a:graphic xmlns:a="http://schemas.openxmlformats.org/drawingml/2006/main">
+                  <a:graphicData uri="http://schemas.microsoft.com/office/word/2010/wordprocessingShape">
+                    <wps:wsp>
+                      <wps:cNvSpPr txBox="1"/>
+                      <wps:spPr>
+                        <a:xfrm>
+                          <a:off x="0" y="0"/>
+                          <a:ext cx="1099820" cy="289560"/>
+                        </a:xfrm>
+                        <a:prstGeom prst="rect">
+                          <a:avLst/>
+                        </a:prstGeom>
+                        <a:solidFill>
+                          <a:srgbClr val="FBF8D8"/>
+                        </a:solidFill>
+                        <a:ln w="6350">
+                          <a:solidFill>
+                            <a:prstClr val="black"/>
+                          </a:solidFill>
+                        </a:ln>
+                        <a:effectLst>
+                          <a:outerShdw blurRad="50800" dist="38100" dir="2700000" algn="tl" rotWithShape="0">
+                            <a:prstClr val="black">
+                              <a:alpha val="40000"/>
+                            </a:prstClr>
+                          </a:outerShdw>
+                        </a:effectLst>
+                      </wps:spPr>
+                      <wps:txbx>
+                        <w:txbxContent>
+                          <w:p>
+                            <w:pPr>
+                              <w:spacing w:after="0"/>
+                              <w:rPr>
+                                <w:rFonts w:ascii="Arial" w:hAnsi="Arial" w:cs="Arial"/>
+                                <w:sz w:val="20"/>
+                                <w:szCs w:val="20"/>
+                              </w:rPr>
+                            </w:pPr>
+                            <w:r>
+                              <w:rPr>
+                                <w:rFonts w:ascii="Arial" w:hAnsi="Arial" w:cs="Arial"/>
+                                <w:sz w:val="20"/>
+                                <w:szCs w:val="20"/>
+                              </w:rPr>
+                              <w:t xml:space="preserve">Core request </w:t>
+                            </w:r>
+                          </w:p>
+                        </w:txbxContent>
+                      </wps:txbx>
+                      <wps:bodyPr rot="0" spcFirstLastPara="0" vertOverflow="overflow" horzOverflow="overflow" vert="horz" wrap="none" lIns="91440" tIns="45720" rIns="91440" bIns="45720" numCol="1" spcCol="0" rtlCol="0" fromWordArt="0" anchor="ctr" anchorCtr="0" forceAA="0" compatLnSpc="1">
+                        <a:prstTxWarp prst="textNoShape">
+                          <a:avLst/>
+                        </a:prstTxWarp>
+                        <a:spAutoFit/>
+                      </wps:bodyPr>
+                    </wps:wsp>
+                  </a:graphicData>
+                </a:graphic>
+                <wp14:sizeRelH relativeFrom="margin">
+                  <wp14:pctWidth>0</wp14:pctWidth>
+                </wp14:sizeRelH>
+                <wp14:sizeRelV relativeFrom="margin">
+                  <wp14:pctHeight>0</wp14:pctHeight>
+                </wp14:sizeRelV>
+              </wp:anchor>
+            </w:drawing>
+          </mc:Choice>
+          <mc:Fallback>
+            <w:pict>
+              <v:shape w14:anchorId="123D5EED" id="_x0000_s1029" type="#_x0000_t202" style="position:absolute;margin-left:239.35pt;margin-top:120.3pt;width:86.6pt;height:22.8pt;z-index:251669504;visibility:visible;mso-wrap-style:none;mso-width-percent:0;mso-height-percent:0;mso-wrap-distance-left:9pt;mso-wrap-distance-top:0;mso-wrap-distance-right:9pt;mso-wrap-distance-bottom:0;mso-position-horizontal:absolute;mso-position-horizontal-relative:text;mso-position-vertical:absolute;mso-position-vertical-relative:text;mso-width-percent:0;mso-height-percent:0;mso-width-relative:margin;mso-height-relative:margin;v-text-anchor:middle" o:gfxdata="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" fillcolor="#fbf8d8" strokeweight=".5pt">
+                <v:shadow on="t" color="black" opacity="26214f" origin="-.5,-.5" offset=".74836mm,.74836mm"/>
+                <v:textbox style="mso-fit-shape-to-text:t">
+                  <w:txbxContent>
+                    <w:p>
+                      <w:pPr>
+                        <w:spacing w:after="0"/>
+                        <w:rPr>
+                          <w:rFonts w:ascii="Arial" w:hAnsi="Arial" w:cs="Arial"/>
+                          <w:sz w:val="20"/>
+                          <w:szCs w:val="20"/>
+                        </w:rPr>
+                      </w:pPr>
+                      <w:r>
+                        <w:rPr>
+                          <w:rFonts w:ascii="Arial" w:hAnsi="Arial" w:cs="Arial"/>
+                          <w:sz w:val="20"/>
+                          <w:szCs w:val="20"/>
+                        </w:rPr>
+                        <w:t xml:space="preserve">Core request </w:t>
+                      </w:r>
+                    </w:p>
+                  </w:txbxContent>
+                </v:textbox>
+              </v:shape>
+            </w:pict>
+          </mc:Fallback>
+        </mc:AlternateContent>
+      </w:r>
+      <w:r>
+        <w:rPr>
+          <w:rFonts w:ascii="Arial" w:hAnsi="Arial" w:cs="Arial"/>
+          <w:noProof/>
+          <w:sz w:val="20"/>
+          <w:szCs w:val="20"/>
+        </w:rPr>
+        <mc:AlternateContent>
+          <mc:Choice Requires="wps">
+            <w:drawing>
               <wp:inline distT="0" distB="0" distL="0" distR="0" wp14:anchorId="1A8AE043" wp14:editId="5CCA2E26">
                 <wp:extent cx="6438585" cy="306729"/>
                 <wp:effectExtent l="25400" t="25400" r="102235" b="100965"/>
@@ -3926,6 +4120,15 @@
         </w:rPr>
         <w:t>he following CBOR code:</w:t>
       </w:r>
+      <w:r>
+        <w:rPr>
+          <w:rFonts w:ascii="Arial" w:hAnsi="Arial" w:cs="Arial"/>
+          <w:noProof/>
+          <w:sz w:val="20"/>
+          <w:szCs w:val="20"/>
+        </w:rPr>
+        <w:t xml:space="preserve"> </w:t>
+      </w:r>
     </w:p>
     <w:p>
       <w:pPr>
@@ -3936,6 +4139,200 @@
           <w:szCs w:val="20"/>
         </w:rPr>
       </w:pPr>
+      <w:r>
+        <w:rPr>
+          <w:rFonts w:ascii="Arial" w:hAnsi="Arial" w:cs="Arial"/>
+          <w:noProof/>
+          <w:sz w:val="20"/>
+          <w:szCs w:val="20"/>
+        </w:rPr>
+        <mc:AlternateContent>
+          <mc:Choice Requires="wps">
+            <w:drawing>
+              <wp:anchor distT="0" distB="0" distL="114300" distR="114300" simplePos="0" relativeHeight="251672576" behindDoc="0" locked="0" layoutInCell="1" allowOverlap="1" wp14:anchorId="123D5EED" wp14:editId="576F6D4F">
+                <wp:simplePos x="0" y="0"/>
+                <wp:positionH relativeFrom="column">
+                  <wp:posOffset>3034665</wp:posOffset>
+                </wp:positionH>
+                <wp:positionV relativeFrom="paragraph">
+                  <wp:posOffset>1756307</wp:posOffset>
+                </wp:positionV>
+                <wp:extent cx="1099820" cy="289560"/>
+                <wp:effectExtent l="25400" t="25400" r="104775" b="102870"/>
+                <wp:wrapNone/>
+                <wp:docPr id="2004958824" name="Text Box 21"/>
+                <wp:cNvGraphicFramePr/>
+                <a:graphic xmlns:a="http://schemas.openxmlformats.org/drawingml/2006/main">
+                  <a:graphicData uri="http://schemas.microsoft.com/office/word/2010/wordprocessingShape">
+                    <wps:wsp>
+                      <wps:cNvSpPr txBox="1"/>
+                      <wps:spPr>
+                        <a:xfrm>
+                          <a:off x="0" y="0"/>
+                          <a:ext cx="1099820" cy="289560"/>
+                        </a:xfrm>
+                        <a:prstGeom prst="rect">
+                          <a:avLst/>
+                        </a:prstGeom>
+                        <a:solidFill>
+                          <a:srgbClr val="FBF8D8"/>
+                        </a:solidFill>
+                        <a:ln w="6350">
+                          <a:solidFill>
+                            <a:prstClr val="black"/>
+                          </a:solidFill>
+                        </a:ln>
+                        <a:effectLst>
+                          <a:outerShdw blurRad="50800" dist="38100" dir="2700000" algn="tl" rotWithShape="0">
+                            <a:prstClr val="black">
+                              <a:alpha val="40000"/>
+                            </a:prstClr>
+                          </a:outerShdw>
+                        </a:effectLst>
+                      </wps:spPr>
+                      <wps:txbx>
+                        <w:txbxContent>
+                          <w:p>
+                            <w:pPr>
+                              <w:spacing w:after="0"/>
+                              <w:rPr>
+                                <w:rFonts w:ascii="Arial" w:hAnsi="Arial" w:cs="Arial"/>
+                                <w:sz w:val="20"/>
+                                <w:szCs w:val="20"/>
+                              </w:rPr>
+                            </w:pPr>
+                            <w:r>
+                              <w:rPr>
+                                <w:rFonts w:ascii="Arial" w:hAnsi="Arial" w:cs="Arial"/>
+                                <w:sz w:val="20"/>
+                                <w:szCs w:val="20"/>
+                              </w:rPr>
+                              <w:t xml:space="preserve">Core request </w:t>
+                            </w:r>
+                          </w:p>
+                        </w:txbxContent>
+                      </wps:txbx>
+                      <wps:bodyPr rot="0" spcFirstLastPara="0" vertOverflow="overflow" horzOverflow="overflow" vert="horz" wrap="none" lIns="91440" tIns="45720" rIns="91440" bIns="45720" numCol="1" spcCol="0" rtlCol="0" fromWordArt="0" anchor="ctr" anchorCtr="0" forceAA="0" compatLnSpc="1">
+                        <a:prstTxWarp prst="textNoShape">
+                          <a:avLst/>
+                        </a:prstTxWarp>
+                        <a:spAutoFit/>
+                      </wps:bodyPr>
+                    </wps:wsp>
+                  </a:graphicData>
+                </a:graphic>
+                <wp14:sizeRelH relativeFrom="margin">
+                  <wp14:pctWidth>0</wp14:pctWidth>
+                </wp14:sizeRelH>
+                <wp14:sizeRelV relativeFrom="margin">
+                  <wp14:pctHeight>0</wp14:pctHeight>
+                </wp14:sizeRelV>
+              </wp:anchor>
+            </w:drawing>
+          </mc:Choice>
+          <mc:Fallback>
+            <w:pict>
+              <v:shape w14:anchorId="123D5EED" id="_x0000_s1031" type="#_x0000_t202" style="position:absolute;margin-left:238.95pt;margin-top:138.3pt;width:86.6pt;height:22.8pt;z-index:251672576;visibility:visible;mso-wrap-style:none;mso-width-percent:0;mso-height-percent:0;mso-wrap-distance-left:9pt;mso-wrap-distance-top:0;mso-wrap-distance-right:9pt;mso-wrap-distance-bottom:0;mso-position-horizontal:absolute;mso-position-horizontal-relative:text;mso-position-vertical:absolute;mso-position-vertical-relative:text;mso-width-percent:0;mso-height-percent:0;mso-width-relative:margin;mso-height-relative:margin;v-text-anchor:middle" o:gfxdata="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" fillcolor="#fbf8d8" strokeweight=".5pt">
+                <v:shadow on="t" color="black" opacity="26214f" origin="-.5,-.5" offset=".74836mm,.74836mm"/>
+                <v:textbox style="mso-fit-shape-to-text:t">
+                  <w:txbxContent>
+                    <w:p>
+                      <w:pPr>
+                        <w:spacing w:after="0"/>
+                        <w:rPr>
+                          <w:rFonts w:ascii="Arial" w:hAnsi="Arial" w:cs="Arial"/>
+                          <w:sz w:val="20"/>
+                          <w:szCs w:val="20"/>
+                        </w:rPr>
+                      </w:pPr>
+                      <w:r>
+                        <w:rPr>
+                          <w:rFonts w:ascii="Arial" w:hAnsi="Arial" w:cs="Arial"/>
+                          <w:sz w:val="20"/>
+                          <w:szCs w:val="20"/>
+                        </w:rPr>
+                        <w:t xml:space="preserve">Core request </w:t>
+                      </w:r>
+                    </w:p>
+                  </w:txbxContent>
+                </v:textbox>
+              </v:shape>
+            </w:pict>
+          </mc:Fallback>
+        </mc:AlternateContent>
+      </w:r>
+      <w:r>
+        <w:rPr>
+          <w:rFonts w:ascii="Arial" w:hAnsi="Arial" w:cs="Arial"/>
+          <w:noProof/>
+          <w:sz w:val="20"/>
+          <w:szCs w:val="20"/>
+        </w:rPr>
+        <mc:AlternateContent>
+          <mc:Choice Requires="wps">
+            <w:drawing>
+              <wp:anchor distT="0" distB="0" distL="114300" distR="114300" simplePos="0" relativeHeight="251671552" behindDoc="0" locked="0" layoutInCell="1" allowOverlap="1" wp14:anchorId="2C0030A6" wp14:editId="1E570941">
+                <wp:simplePos x="0" y="0"/>
+                <wp:positionH relativeFrom="column">
+                  <wp:posOffset>2752828</wp:posOffset>
+                </wp:positionH>
+                <wp:positionV relativeFrom="paragraph">
+                  <wp:posOffset>1463675</wp:posOffset>
+                </wp:positionV>
+                <wp:extent cx="207645" cy="832485"/>
+                <wp:effectExtent l="0" t="0" r="8255" b="18415"/>
+                <wp:wrapNone/>
+                <wp:docPr id="1199026277" name="Right Brace 20"/>
+                <wp:cNvGraphicFramePr/>
+                <a:graphic xmlns:a="http://schemas.openxmlformats.org/drawingml/2006/main">
+                  <a:graphicData uri="http://schemas.microsoft.com/office/word/2010/wordprocessingShape">
+                    <wps:wsp>
+                      <wps:cNvSpPr/>
+                      <wps:spPr>
+                        <a:xfrm>
+                          <a:off x="0" y="0"/>
+                          <a:ext cx="207645" cy="832485"/>
+                        </a:xfrm>
+                        <a:prstGeom prst="rightBrace">
+                          <a:avLst/>
+                        </a:prstGeom>
+                      </wps:spPr>
+                      <wps:style>
+                        <a:lnRef idx="1">
+                          <a:schemeClr val="accent1"/>
+                        </a:lnRef>
+                        <a:fillRef idx="0">
+                          <a:schemeClr val="accent1"/>
+                        </a:fillRef>
+                        <a:effectRef idx="0">
+                          <a:schemeClr val="accent1"/>
+                        </a:effectRef>
+                        <a:fontRef idx="minor">
+                          <a:schemeClr val="tx1"/>
+                        </a:fontRef>
+                      </wps:style>
+                      <wps:bodyPr rot="0" spcFirstLastPara="0" vertOverflow="overflow" horzOverflow="overflow" vert="horz" wrap="square" lIns="91440" tIns="45720" rIns="91440" bIns="45720" numCol="1" spcCol="0" rtlCol="0" fromWordArt="0" anchor="ctr" anchorCtr="0" forceAA="0" compatLnSpc="1">
+                        <a:prstTxWarp prst="textNoShape">
+                          <a:avLst/>
+                        </a:prstTxWarp>
+                        <a:noAutofit/>
+                      </wps:bodyPr>
+                    </wps:wsp>
+                  </a:graphicData>
+                </a:graphic>
+                <wp14:sizeRelH relativeFrom="margin">
+                  <wp14:pctWidth>0</wp14:pctWidth>
+                </wp14:sizeRelH>
+              </wp:anchor>
+            </w:drawing>
+          </mc:Choice>
+          <mc:Fallback>
+            <w:pict>
+              <v:shape w14:anchorId="0993BEF5" id="Right Brace 20" o:spid="_x0000_s1026" type="#_x0000_t88" style="position:absolute;margin-left:216.75pt;margin-top:115.25pt;width:16.35pt;height:65.55pt;z-index:251671552;visibility:visible;mso-wrap-style:square;mso-width-percent:0;mso-wrap-distance-left:9pt;mso-wrap-distance-top:0;mso-wrap-distance-right:9pt;mso-wrap-distance-bottom:0;mso-position-horizontal:absolute;mso-position-horizontal-relative:text;mso-position-vertical:absolute;mso-position-vertical-relative:text;mso-width-percent:0;mso-width-relative:margin;v-text-anchor:middle" o:gfxdata="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" adj="449" strokecolor="#4579b8 [3044]"/>
+            </w:pict>
+          </mc:Fallback>
+        </mc:AlternateContent>
+      </w:r>
       <w:r>
         <w:rPr>
           <w:rFonts w:ascii="Arial" w:hAnsi="Arial" w:cs="Arial"/>
@@ -5427,6 +5824,200 @@
         <mc:AlternateContent>
           <mc:Choice Requires="wps">
             <w:drawing>
+              <wp:anchor distT="0" distB="0" distL="114300" distR="114300" simplePos="0" relativeHeight="251675648" behindDoc="0" locked="0" layoutInCell="1" allowOverlap="1" wp14:anchorId="123D5EED" wp14:editId="576F6D4F">
+                <wp:simplePos x="0" y="0"/>
+                <wp:positionH relativeFrom="column">
+                  <wp:posOffset>2914015</wp:posOffset>
+                </wp:positionH>
+                <wp:positionV relativeFrom="paragraph">
+                  <wp:posOffset>1421130</wp:posOffset>
+                </wp:positionV>
+                <wp:extent cx="1099820" cy="289560"/>
+                <wp:effectExtent l="25400" t="25400" r="104775" b="102870"/>
+                <wp:wrapNone/>
+                <wp:docPr id="1236918798" name="Text Box 21"/>
+                <wp:cNvGraphicFramePr/>
+                <a:graphic xmlns:a="http://schemas.openxmlformats.org/drawingml/2006/main">
+                  <a:graphicData uri="http://schemas.microsoft.com/office/word/2010/wordprocessingShape">
+                    <wps:wsp>
+                      <wps:cNvSpPr txBox="1"/>
+                      <wps:spPr>
+                        <a:xfrm>
+                          <a:off x="0" y="0"/>
+                          <a:ext cx="1099820" cy="289560"/>
+                        </a:xfrm>
+                        <a:prstGeom prst="rect">
+                          <a:avLst/>
+                        </a:prstGeom>
+                        <a:solidFill>
+                          <a:srgbClr val="FBF8D8"/>
+                        </a:solidFill>
+                        <a:ln w="6350">
+                          <a:solidFill>
+                            <a:prstClr val="black"/>
+                          </a:solidFill>
+                        </a:ln>
+                        <a:effectLst>
+                          <a:outerShdw blurRad="50800" dist="38100" dir="2700000" algn="tl" rotWithShape="0">
+                            <a:prstClr val="black">
+                              <a:alpha val="40000"/>
+                            </a:prstClr>
+                          </a:outerShdw>
+                        </a:effectLst>
+                      </wps:spPr>
+                      <wps:txbx>
+                        <w:txbxContent>
+                          <w:p>
+                            <w:pPr>
+                              <w:spacing w:after="0"/>
+                              <w:rPr>
+                                <w:rFonts w:ascii="Arial" w:hAnsi="Arial" w:cs="Arial"/>
+                                <w:sz w:val="20"/>
+                                <w:szCs w:val="20"/>
+                              </w:rPr>
+                            </w:pPr>
+                            <w:r>
+                              <w:rPr>
+                                <w:rFonts w:ascii="Arial" w:hAnsi="Arial" w:cs="Arial"/>
+                                <w:sz w:val="20"/>
+                                <w:szCs w:val="20"/>
+                              </w:rPr>
+                              <w:t xml:space="preserve">Core request </w:t>
+                            </w:r>
+                          </w:p>
+                        </w:txbxContent>
+                      </wps:txbx>
+                      <wps:bodyPr rot="0" spcFirstLastPara="0" vertOverflow="overflow" horzOverflow="overflow" vert="horz" wrap="none" lIns="91440" tIns="45720" rIns="91440" bIns="45720" numCol="1" spcCol="0" rtlCol="0" fromWordArt="0" anchor="ctr" anchorCtr="0" forceAA="0" compatLnSpc="1">
+                        <a:prstTxWarp prst="textNoShape">
+                          <a:avLst/>
+                        </a:prstTxWarp>
+                        <a:spAutoFit/>
+                      </wps:bodyPr>
+                    </wps:wsp>
+                  </a:graphicData>
+                </a:graphic>
+                <wp14:sizeRelH relativeFrom="margin">
+                  <wp14:pctWidth>0</wp14:pctWidth>
+                </wp14:sizeRelH>
+                <wp14:sizeRelV relativeFrom="margin">
+                  <wp14:pctHeight>0</wp14:pctHeight>
+                </wp14:sizeRelV>
+              </wp:anchor>
+            </w:drawing>
+          </mc:Choice>
+          <mc:Fallback>
+            <w:pict>
+              <v:shape w14:anchorId="123D5EED" id="_x0000_s1033" type="#_x0000_t202" style="position:absolute;margin-left:229.45pt;margin-top:111.9pt;width:86.6pt;height:22.8pt;z-index:251675648;visibility:visible;mso-wrap-style:none;mso-width-percent:0;mso-height-percent:0;mso-wrap-distance-left:9pt;mso-wrap-distance-top:0;mso-wrap-distance-right:9pt;mso-wrap-distance-bottom:0;mso-position-horizontal:absolute;mso-position-horizontal-relative:text;mso-position-vertical:absolute;mso-position-vertical-relative:text;mso-width-percent:0;mso-height-percent:0;mso-width-relative:margin;mso-height-relative:margin;v-text-anchor:middle" o:gfxdata="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" fillcolor="#fbf8d8" strokeweight=".5pt">
+                <v:shadow on="t" color="black" opacity="26214f" origin="-.5,-.5" offset=".74836mm,.74836mm"/>
+                <v:textbox style="mso-fit-shape-to-text:t">
+                  <w:txbxContent>
+                    <w:p>
+                      <w:pPr>
+                        <w:spacing w:after="0"/>
+                        <w:rPr>
+                          <w:rFonts w:ascii="Arial" w:hAnsi="Arial" w:cs="Arial"/>
+                          <w:sz w:val="20"/>
+                          <w:szCs w:val="20"/>
+                        </w:rPr>
+                      </w:pPr>
+                      <w:r>
+                        <w:rPr>
+                          <w:rFonts w:ascii="Arial" w:hAnsi="Arial" w:cs="Arial"/>
+                          <w:sz w:val="20"/>
+                          <w:szCs w:val="20"/>
+                        </w:rPr>
+                        <w:t xml:space="preserve">Core request </w:t>
+                      </w:r>
+                    </w:p>
+                  </w:txbxContent>
+                </v:textbox>
+              </v:shape>
+            </w:pict>
+          </mc:Fallback>
+        </mc:AlternateContent>
+      </w:r>
+      <w:r>
+        <w:rPr>
+          <w:rFonts w:ascii="Arial" w:hAnsi="Arial" w:cs="Arial"/>
+          <w:noProof/>
+          <w:sz w:val="20"/>
+          <w:szCs w:val="20"/>
+        </w:rPr>
+        <mc:AlternateContent>
+          <mc:Choice Requires="wps">
+            <w:drawing>
+              <wp:anchor distT="0" distB="0" distL="114300" distR="114300" simplePos="0" relativeHeight="251674624" behindDoc="0" locked="0" layoutInCell="1" allowOverlap="1" wp14:anchorId="2C0030A6" wp14:editId="1E570941">
+                <wp:simplePos x="0" y="0"/>
+                <wp:positionH relativeFrom="column">
+                  <wp:posOffset>2632178</wp:posOffset>
+                </wp:positionH>
+                <wp:positionV relativeFrom="paragraph">
+                  <wp:posOffset>1130300</wp:posOffset>
+                </wp:positionV>
+                <wp:extent cx="207645" cy="832485"/>
+                <wp:effectExtent l="0" t="0" r="8255" b="18415"/>
+                <wp:wrapNone/>
+                <wp:docPr id="1058385040" name="Right Brace 20"/>
+                <wp:cNvGraphicFramePr/>
+                <a:graphic xmlns:a="http://schemas.openxmlformats.org/drawingml/2006/main">
+                  <a:graphicData uri="http://schemas.microsoft.com/office/word/2010/wordprocessingShape">
+                    <wps:wsp>
+                      <wps:cNvSpPr/>
+                      <wps:spPr>
+                        <a:xfrm>
+                          <a:off x="0" y="0"/>
+                          <a:ext cx="207645" cy="832485"/>
+                        </a:xfrm>
+                        <a:prstGeom prst="rightBrace">
+                          <a:avLst/>
+                        </a:prstGeom>
+                      </wps:spPr>
+                      <wps:style>
+                        <a:lnRef idx="1">
+                          <a:schemeClr val="accent1"/>
+                        </a:lnRef>
+                        <a:fillRef idx="0">
+                          <a:schemeClr val="accent1"/>
+                        </a:fillRef>
+                        <a:effectRef idx="0">
+                          <a:schemeClr val="accent1"/>
+                        </a:effectRef>
+                        <a:fontRef idx="minor">
+                          <a:schemeClr val="tx1"/>
+                        </a:fontRef>
+                      </wps:style>
+                      <wps:bodyPr rot="0" spcFirstLastPara="0" vertOverflow="overflow" horzOverflow="overflow" vert="horz" wrap="square" lIns="91440" tIns="45720" rIns="91440" bIns="45720" numCol="1" spcCol="0" rtlCol="0" fromWordArt="0" anchor="ctr" anchorCtr="0" forceAA="0" compatLnSpc="1">
+                        <a:prstTxWarp prst="textNoShape">
+                          <a:avLst/>
+                        </a:prstTxWarp>
+                        <a:noAutofit/>
+                      </wps:bodyPr>
+                    </wps:wsp>
+                  </a:graphicData>
+                </a:graphic>
+                <wp14:sizeRelH relativeFrom="margin">
+                  <wp14:pctWidth>0</wp14:pctWidth>
+                </wp14:sizeRelH>
+              </wp:anchor>
+            </w:drawing>
+          </mc:Choice>
+          <mc:Fallback>
+            <w:pict>
+              <v:shape w14:anchorId="6F5F46B0" id="Right Brace 20" o:spid="_x0000_s1026" type="#_x0000_t88" style="position:absolute;margin-left:207.25pt;margin-top:89pt;width:16.35pt;height:65.55pt;z-index:251674624;visibility:visible;mso-wrap-style:square;mso-width-percent:0;mso-wrap-distance-left:9pt;mso-wrap-distance-top:0;mso-wrap-distance-right:9pt;mso-wrap-distance-bottom:0;mso-position-horizontal:absolute;mso-position-horizontal-relative:text;mso-position-vertical:absolute;mso-position-vertical-relative:text;mso-width-percent:0;mso-width-relative:margin;v-text-anchor:middle" o:gfxdata="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" adj="449" strokecolor="#4579b8 [3044]"/>
+            </w:pict>
+          </mc:Fallback>
+        </mc:AlternateContent>
+      </w:r>
+      <w:r>
+        <w:rPr>
+          <w:rFonts w:ascii="Arial" w:hAnsi="Arial" w:cs="Arial"/>
+          <w:noProof/>
+          <w:sz w:val="20"/>
+          <w:szCs w:val="20"/>
+        </w:rPr>
+        <mc:AlternateContent>
+          <mc:Choice Requires="wps">
+            <w:drawing>
               <wp:inline distT="0" distB="0" distL="0" distR="0" wp14:anchorId="0853E542" wp14:editId="158ECA8E">
                 <wp:extent cx="6438585" cy="306729"/>
                 <wp:effectExtent l="25400" t="25400" r="102235" b="99695"/>
@@ -6855,6 +7446,15 @@
         </w:rPr>
         <w:t xml:space="preserve"> object:</w:t>
       </w:r>
+      <w:r>
+        <w:rPr>
+          <w:rFonts w:ascii="Arial" w:hAnsi="Arial" w:cs="Arial"/>
+          <w:noProof/>
+          <w:sz w:val="20"/>
+          <w:szCs w:val="20"/>
+        </w:rPr>
+        <w:t xml:space="preserve"> </w:t>
+      </w:r>
     </w:p>
     <w:p>
       <w:pPr>
@@ -6865,6 +7465,200 @@
           <w:szCs w:val="20"/>
         </w:rPr>
       </w:pPr>
+      <w:r>
+        <w:rPr>
+          <w:rFonts w:ascii="Arial" w:hAnsi="Arial" w:cs="Arial"/>
+          <w:noProof/>
+          <w:sz w:val="20"/>
+          <w:szCs w:val="20"/>
+        </w:rPr>
+        <mc:AlternateContent>
+          <mc:Choice Requires="wps">
+            <w:drawing>
+              <wp:anchor distT="0" distB="0" distL="114300" distR="114300" simplePos="0" relativeHeight="251678720" behindDoc="0" locked="0" layoutInCell="1" allowOverlap="1" wp14:anchorId="123D5EED" wp14:editId="576F6D4F">
+                <wp:simplePos x="0" y="0"/>
+                <wp:positionH relativeFrom="column">
+                  <wp:posOffset>3048635</wp:posOffset>
+                </wp:positionH>
+                <wp:positionV relativeFrom="paragraph">
+                  <wp:posOffset>1589937</wp:posOffset>
+                </wp:positionV>
+                <wp:extent cx="1099820" cy="289560"/>
+                <wp:effectExtent l="25400" t="25400" r="104775" b="102870"/>
+                <wp:wrapNone/>
+                <wp:docPr id="1100422199" name="Text Box 21"/>
+                <wp:cNvGraphicFramePr/>
+                <a:graphic xmlns:a="http://schemas.openxmlformats.org/drawingml/2006/main">
+                  <a:graphicData uri="http://schemas.microsoft.com/office/word/2010/wordprocessingShape">
+                    <wps:wsp>
+                      <wps:cNvSpPr txBox="1"/>
+                      <wps:spPr>
+                        <a:xfrm>
+                          <a:off x="0" y="0"/>
+                          <a:ext cx="1099820" cy="289560"/>
+                        </a:xfrm>
+                        <a:prstGeom prst="rect">
+                          <a:avLst/>
+                        </a:prstGeom>
+                        <a:solidFill>
+                          <a:srgbClr val="FBF8D8"/>
+                        </a:solidFill>
+                        <a:ln w="6350">
+                          <a:solidFill>
+                            <a:prstClr val="black"/>
+                          </a:solidFill>
+                        </a:ln>
+                        <a:effectLst>
+                          <a:outerShdw blurRad="50800" dist="38100" dir="2700000" algn="tl" rotWithShape="0">
+                            <a:prstClr val="black">
+                              <a:alpha val="40000"/>
+                            </a:prstClr>
+                          </a:outerShdw>
+                        </a:effectLst>
+                      </wps:spPr>
+                      <wps:txbx>
+                        <w:txbxContent>
+                          <w:p>
+                            <w:pPr>
+                              <w:spacing w:after="0"/>
+                              <w:rPr>
+                                <w:rFonts w:ascii="Arial" w:hAnsi="Arial" w:cs="Arial"/>
+                                <w:sz w:val="20"/>
+                                <w:szCs w:val="20"/>
+                              </w:rPr>
+                            </w:pPr>
+                            <w:r>
+                              <w:rPr>
+                                <w:rFonts w:ascii="Arial" w:hAnsi="Arial" w:cs="Arial"/>
+                                <w:sz w:val="20"/>
+                                <w:szCs w:val="20"/>
+                              </w:rPr>
+                              <w:t xml:space="preserve">Core request </w:t>
+                            </w:r>
+                          </w:p>
+                        </w:txbxContent>
+                      </wps:txbx>
+                      <wps:bodyPr rot="0" spcFirstLastPara="0" vertOverflow="overflow" horzOverflow="overflow" vert="horz" wrap="none" lIns="91440" tIns="45720" rIns="91440" bIns="45720" numCol="1" spcCol="0" rtlCol="0" fromWordArt="0" anchor="ctr" anchorCtr="0" forceAA="0" compatLnSpc="1">
+                        <a:prstTxWarp prst="textNoShape">
+                          <a:avLst/>
+                        </a:prstTxWarp>
+                        <a:spAutoFit/>
+                      </wps:bodyPr>
+                    </wps:wsp>
+                  </a:graphicData>
+                </a:graphic>
+                <wp14:sizeRelH relativeFrom="margin">
+                  <wp14:pctWidth>0</wp14:pctWidth>
+                </wp14:sizeRelH>
+                <wp14:sizeRelV relativeFrom="margin">
+                  <wp14:pctHeight>0</wp14:pctHeight>
+                </wp14:sizeRelV>
+              </wp:anchor>
+            </w:drawing>
+          </mc:Choice>
+          <mc:Fallback>
+            <w:pict>
+              <v:shape w14:anchorId="123D5EED" id="_x0000_s1036" type="#_x0000_t202" style="position:absolute;margin-left:240.05pt;margin-top:125.2pt;width:86.6pt;height:22.8pt;z-index:251678720;visibility:visible;mso-wrap-style:none;mso-width-percent:0;mso-height-percent:0;mso-wrap-distance-left:9pt;mso-wrap-distance-top:0;mso-wrap-distance-right:9pt;mso-wrap-distance-bottom:0;mso-position-horizontal:absolute;mso-position-horizontal-relative:text;mso-position-vertical:absolute;mso-position-vertical-relative:text;mso-width-percent:0;mso-height-percent:0;mso-width-relative:margin;mso-height-relative:margin;v-text-anchor:middle" o:gfxdata="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" fillcolor="#fbf8d8" strokeweight=".5pt">
+                <v:shadow on="t" color="black" opacity="26214f" origin="-.5,-.5" offset=".74836mm,.74836mm"/>
+                <v:textbox style="mso-fit-shape-to-text:t">
+                  <w:txbxContent>
+                    <w:p>
+                      <w:pPr>
+                        <w:spacing w:after="0"/>
+                        <w:rPr>
+                          <w:rFonts w:ascii="Arial" w:hAnsi="Arial" w:cs="Arial"/>
+                          <w:sz w:val="20"/>
+                          <w:szCs w:val="20"/>
+                        </w:rPr>
+                      </w:pPr>
+                      <w:r>
+                        <w:rPr>
+                          <w:rFonts w:ascii="Arial" w:hAnsi="Arial" w:cs="Arial"/>
+                          <w:sz w:val="20"/>
+                          <w:szCs w:val="20"/>
+                        </w:rPr>
+                        <w:t xml:space="preserve">Core request </w:t>
+                      </w:r>
+                    </w:p>
+                  </w:txbxContent>
+                </v:textbox>
+              </v:shape>
+            </w:pict>
+          </mc:Fallback>
+        </mc:AlternateContent>
+      </w:r>
+      <w:r>
+        <w:rPr>
+          <w:rFonts w:ascii="Arial" w:hAnsi="Arial" w:cs="Arial"/>
+          <w:noProof/>
+          <w:sz w:val="20"/>
+          <w:szCs w:val="20"/>
+        </w:rPr>
+        <mc:AlternateContent>
+          <mc:Choice Requires="wps">
+            <w:drawing>
+              <wp:anchor distT="0" distB="0" distL="114300" distR="114300" simplePos="0" relativeHeight="251677696" behindDoc="0" locked="0" layoutInCell="1" allowOverlap="1" wp14:anchorId="2C0030A6" wp14:editId="1E570941">
+                <wp:simplePos x="0" y="0"/>
+                <wp:positionH relativeFrom="column">
+                  <wp:posOffset>2766695</wp:posOffset>
+                </wp:positionH>
+                <wp:positionV relativeFrom="paragraph">
+                  <wp:posOffset>1297837</wp:posOffset>
+                </wp:positionV>
+                <wp:extent cx="207645" cy="832485"/>
+                <wp:effectExtent l="0" t="0" r="8255" b="18415"/>
+                <wp:wrapNone/>
+                <wp:docPr id="1246441003" name="Right Brace 20"/>
+                <wp:cNvGraphicFramePr/>
+                <a:graphic xmlns:a="http://schemas.openxmlformats.org/drawingml/2006/main">
+                  <a:graphicData uri="http://schemas.microsoft.com/office/word/2010/wordprocessingShape">
+                    <wps:wsp>
+                      <wps:cNvSpPr/>
+                      <wps:spPr>
+                        <a:xfrm>
+                          <a:off x="0" y="0"/>
+                          <a:ext cx="207645" cy="832485"/>
+                        </a:xfrm>
+                        <a:prstGeom prst="rightBrace">
+                          <a:avLst/>
+                        </a:prstGeom>
+                      </wps:spPr>
+                      <wps:style>
+                        <a:lnRef idx="1">
+                          <a:schemeClr val="accent1"/>
+                        </a:lnRef>
+                        <a:fillRef idx="0">
+                          <a:schemeClr val="accent1"/>
+                        </a:fillRef>
+                        <a:effectRef idx="0">
+                          <a:schemeClr val="accent1"/>
+                        </a:effectRef>
+                        <a:fontRef idx="minor">
+                          <a:schemeClr val="tx1"/>
+                        </a:fontRef>
+                      </wps:style>
+                      <wps:bodyPr rot="0" spcFirstLastPara="0" vertOverflow="overflow" horzOverflow="overflow" vert="horz" wrap="square" lIns="91440" tIns="45720" rIns="91440" bIns="45720" numCol="1" spcCol="0" rtlCol="0" fromWordArt="0" anchor="ctr" anchorCtr="0" forceAA="0" compatLnSpc="1">
+                        <a:prstTxWarp prst="textNoShape">
+                          <a:avLst/>
+                        </a:prstTxWarp>
+                        <a:noAutofit/>
+                      </wps:bodyPr>
+                    </wps:wsp>
+                  </a:graphicData>
+                </a:graphic>
+                <wp14:sizeRelH relativeFrom="margin">
+                  <wp14:pctWidth>0</wp14:pctWidth>
+                </wp14:sizeRelH>
+              </wp:anchor>
+            </w:drawing>
+          </mc:Choice>
+          <mc:Fallback>
+            <w:pict>
+              <v:shape w14:anchorId="1FA29C45" id="Right Brace 20" o:spid="_x0000_s1026" type="#_x0000_t88" style="position:absolute;margin-left:217.85pt;margin-top:102.2pt;width:16.35pt;height:65.55pt;z-index:251677696;visibility:visible;mso-wrap-style:square;mso-width-percent:0;mso-wrap-distance-left:9pt;mso-wrap-distance-top:0;mso-wrap-distance-right:9pt;mso-wrap-distance-bottom:0;mso-position-horizontal:absolute;mso-position-horizontal-relative:text;mso-position-vertical:absolute;mso-position-vertical-relative:text;mso-width-percent:0;mso-width-relative:margin;v-text-anchor:middle" o:gfxdata="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" adj="449" strokecolor="#4579b8 [3044]"/>
+            </w:pict>
+          </mc:Fallback>
+        </mc:AlternateContent>
+      </w:r>
       <w:r>
         <w:rPr>
           <w:rFonts w:ascii="Arial" w:hAnsi="Arial" w:cs="Arial"/>

</xml_diff>

<commit_message>
partial-enc-update CDE => rundgren
</commit_message>
<xml_diff>
--- a/defensive-publications/partial-encryption-full-signature.docx
+++ b/defensive-publications/partial-encryption-full-signature.docx
@@ -1340,7 +1340,25 @@
             <w:sz w:val="20"/>
             <w:szCs w:val="20"/>
           </w:rPr>
-          <w:t>CORE</w:t>
+          <w:t>C</w:t>
+        </w:r>
+        <w:r>
+          <w:rPr>
+            <w:rStyle w:val="Hyperlink"/>
+            <w:rFonts w:ascii="Arial" w:hAnsi="Arial" w:cs="Arial"/>
+            <w:sz w:val="20"/>
+            <w:szCs w:val="20"/>
+          </w:rPr>
+          <w:t>O</w:t>
+        </w:r>
+        <w:r>
+          <w:rPr>
+            <w:rStyle w:val="Hyperlink"/>
+            <w:rFonts w:ascii="Arial" w:hAnsi="Arial" w:cs="Arial"/>
+            <w:sz w:val="20"/>
+            <w:szCs w:val="20"/>
+          </w:rPr>
+          <w:t>RE</w:t>
         </w:r>
       </w:hyperlink>
       <w:r>
@@ -1672,26 +1690,105 @@
                 <w:sz w:val="20"/>
                 <w:szCs w:val="20"/>
               </w:rPr>
-              <w:t>Note that the described concept depends on that the CBOR serializer and parser supports Deterministic Encoding [</w:t>
+              <w:t xml:space="preserve">Note that the described concept depends on that the CBOR serializer and parser supports Deterministic Encoding </w:t>
             </w:r>
-            <w:hyperlink w:anchor="CDE" w:history="1">
-              <w:r>
-                <w:rPr>
-                  <w:rStyle w:val="Hyperlink"/>
-                  <w:rFonts w:ascii="Arial" w:hAnsi="Arial" w:cs="Arial"/>
-                  <w:sz w:val="20"/>
-                  <w:szCs w:val="20"/>
-                </w:rPr>
-                <w:t>CDE</w:t>
-              </w:r>
-            </w:hyperlink>
             <w:r>
               <w:rPr>
                 <w:rFonts w:ascii="Arial" w:hAnsi="Arial" w:cs="Arial"/>
                 <w:sz w:val="20"/>
                 <w:szCs w:val="20"/>
               </w:rPr>
-              <w:t xml:space="preserve">], </w:t>
+              <w:t>[</w:t>
+            </w:r>
+            <w:r>
+              <w:rPr>
+                <w:rFonts w:ascii="Arial" w:hAnsi="Arial" w:cs="Arial"/>
+                <w:sz w:val="20"/>
+                <w:szCs w:val="20"/>
+              </w:rPr>
+              <w:fldChar w:fldCharType="begin"/>
+            </w:r>
+            <w:r>
+              <w:rPr>
+                <w:rFonts w:ascii="Arial" w:hAnsi="Arial" w:cs="Arial"/>
+                <w:sz w:val="20"/>
+                <w:szCs w:val="20"/>
+              </w:rPr>
+              <w:instrText>HYPERLINK  \l "DCBOR"</w:instrText>
+            </w:r>
+            <w:r>
+              <w:rPr>
+                <w:rFonts w:ascii="Arial" w:hAnsi="Arial" w:cs="Arial"/>
+                <w:sz w:val="20"/>
+                <w:szCs w:val="20"/>
+              </w:rPr>
+            </w:r>
+            <w:r>
+              <w:rPr>
+                <w:rFonts w:ascii="Arial" w:hAnsi="Arial" w:cs="Arial"/>
+                <w:sz w:val="20"/>
+                <w:szCs w:val="20"/>
+              </w:rPr>
+              <w:fldChar w:fldCharType="separate"/>
+            </w:r>
+            <w:r>
+              <w:rPr>
+                <w:rStyle w:val="Hyperlink"/>
+                <w:rFonts w:ascii="Arial" w:hAnsi="Arial" w:cs="Arial"/>
+                <w:sz w:val="20"/>
+                <w:szCs w:val="20"/>
+              </w:rPr>
+              <w:t>DC</w:t>
+            </w:r>
+            <w:r>
+              <w:rPr>
+                <w:rStyle w:val="Hyperlink"/>
+                <w:rFonts w:ascii="Arial" w:hAnsi="Arial" w:cs="Arial"/>
+                <w:sz w:val="20"/>
+                <w:szCs w:val="20"/>
+              </w:rPr>
+              <w:t>B</w:t>
+            </w:r>
+            <w:r>
+              <w:rPr>
+                <w:rStyle w:val="Hyperlink"/>
+                <w:rFonts w:ascii="Arial" w:hAnsi="Arial" w:cs="Arial"/>
+                <w:sz w:val="20"/>
+                <w:szCs w:val="20"/>
+              </w:rPr>
+              <w:t>OR</w:t>
+            </w:r>
+            <w:r>
+              <w:rPr>
+                <w:rFonts w:ascii="Arial" w:hAnsi="Arial" w:cs="Arial"/>
+                <w:sz w:val="20"/>
+                <w:szCs w:val="20"/>
+              </w:rPr>
+              <w:fldChar w:fldCharType="end"/>
+            </w:r>
+            <w:r>
+              <w:rPr>
+                <w:rFonts w:ascii="Arial" w:hAnsi="Arial" w:cs="Arial"/>
+                <w:sz w:val="20"/>
+                <w:szCs w:val="20"/>
+              </w:rPr>
+              <w:t>]</w:t>
+            </w:r>
+            <w:r>
+              <w:rPr>
+                <w:rFonts w:ascii="Arial" w:hAnsi="Arial" w:cs="Arial"/>
+                <w:sz w:val="20"/>
+                <w:szCs w:val="20"/>
+              </w:rPr>
+              <w:t>,</w:t>
+            </w:r>
+            <w:r>
+              <w:rPr>
+                <w:rFonts w:ascii="Arial" w:hAnsi="Arial" w:cs="Arial"/>
+                <w:sz w:val="20"/>
+                <w:szCs w:val="20"/>
+              </w:rPr>
+              <w:t xml:space="preserve"> </w:t>
             </w:r>
             <w:r>
               <w:rPr>
@@ -11480,8 +11577,8 @@
       </w:tblPr>
       <w:tblGrid>
         <w:gridCol w:w="1072"/>
-        <w:gridCol w:w="3926"/>
-        <w:gridCol w:w="5634"/>
+        <w:gridCol w:w="3405"/>
+        <w:gridCol w:w="6155"/>
       </w:tblGrid>
       <w:tr>
         <w:tc>
@@ -11512,7 +11609,7 @@
         </w:tc>
         <w:tc>
           <w:tcPr>
-            <w:tcW w:w="3926" w:type="dxa"/>
+            <w:tcW w:w="3405" w:type="dxa"/>
             <w:shd w:val="clear" w:color="auto" w:fill="F2F2F2" w:themeFill="background1" w:themeFillShade="F2"/>
             <w:vAlign w:val="center"/>
           </w:tcPr>
@@ -11538,7 +11635,7 @@
         </w:tc>
         <w:tc>
           <w:tcPr>
-            <w:tcW w:w="5634" w:type="dxa"/>
+            <w:tcW w:w="6155" w:type="dxa"/>
             <w:shd w:val="clear" w:color="auto" w:fill="F2F2F2" w:themeFill="background1" w:themeFillShade="F2"/>
             <w:vAlign w:val="center"/>
           </w:tcPr>
@@ -11592,7 +11689,7 @@
         </w:tc>
         <w:tc>
           <w:tcPr>
-            <w:tcW w:w="3926" w:type="dxa"/>
+            <w:tcW w:w="3405" w:type="dxa"/>
             <w:vAlign w:val="center"/>
           </w:tcPr>
           <w:p>
@@ -11616,7 +11713,7 @@
         </w:tc>
         <w:tc>
           <w:tcPr>
-            <w:tcW w:w="5634" w:type="dxa"/>
+            <w:tcW w:w="6155" w:type="dxa"/>
             <w:vAlign w:val="center"/>
           </w:tcPr>
           <w:p>
@@ -11663,7 +11760,7 @@
         </w:tc>
         <w:tc>
           <w:tcPr>
-            <w:tcW w:w="3926" w:type="dxa"/>
+            <w:tcW w:w="3405" w:type="dxa"/>
             <w:vAlign w:val="center"/>
           </w:tcPr>
           <w:p>
@@ -11687,7 +11784,7 @@
         </w:tc>
         <w:tc>
           <w:tcPr>
-            <w:tcW w:w="5634" w:type="dxa"/>
+            <w:tcW w:w="6155" w:type="dxa"/>
             <w:vAlign w:val="center"/>
           </w:tcPr>
           <w:p>
@@ -11720,21 +11817,21 @@
                 <w:szCs w:val="20"/>
               </w:rPr>
             </w:pPr>
-            <w:bookmarkStart w:id="3" w:name="CDE"/>
+            <w:bookmarkStart w:id="3" w:name="DCBOR"/>
             <w:r>
               <w:rPr>
                 <w:rFonts w:ascii="Arial" w:hAnsi="Arial" w:cs="Arial"/>
                 <w:sz w:val="20"/>
                 <w:szCs w:val="20"/>
               </w:rPr>
-              <w:t>CDE</w:t>
+              <w:t>DCBOR</w:t>
             </w:r>
             <w:bookmarkEnd w:id="3"/>
           </w:p>
         </w:tc>
         <w:tc>
           <w:tcPr>
-            <w:tcW w:w="3926" w:type="dxa"/>
+            <w:tcW w:w="3405" w:type="dxa"/>
             <w:vAlign w:val="center"/>
           </w:tcPr>
           <w:p>
@@ -11758,7 +11855,7 @@
         </w:tc>
         <w:tc>
           <w:tcPr>
-            <w:tcW w:w="5634" w:type="dxa"/>
+            <w:tcW w:w="6155" w:type="dxa"/>
             <w:vAlign w:val="center"/>
           </w:tcPr>
           <w:p>
@@ -11770,7 +11867,7 @@
                 <w:rPr>
                   <w:rStyle w:val="Hyperlink"/>
                 </w:rPr>
-                <w:t>https://datatracker.ietf.org/doc/draft-ietf-cbor-cde/</w:t>
+                <w:t>https://datatracker.ietf.org/doc/draft-rundgren-universal-cbor/</w:t>
               </w:r>
             </w:hyperlink>
           </w:p>
@@ -11805,7 +11902,7 @@
         </w:tc>
         <w:tc>
           <w:tcPr>
-            <w:tcW w:w="3926" w:type="dxa"/>
+            <w:tcW w:w="3405" w:type="dxa"/>
             <w:vAlign w:val="center"/>
           </w:tcPr>
           <w:p>
@@ -11856,7 +11953,7 @@
         </w:tc>
         <w:tc>
           <w:tcPr>
-            <w:tcW w:w="5634" w:type="dxa"/>
+            <w:tcW w:w="6155" w:type="dxa"/>
             <w:vAlign w:val="center"/>
           </w:tcPr>
           <w:p>
@@ -11903,7 +12000,7 @@
         </w:tc>
         <w:tc>
           <w:tcPr>
-            <w:tcW w:w="3926" w:type="dxa"/>
+            <w:tcW w:w="3405" w:type="dxa"/>
             <w:vAlign w:val="center"/>
           </w:tcPr>
           <w:p>
@@ -11943,7 +12040,7 @@
         </w:tc>
         <w:tc>
           <w:tcPr>
-            <w:tcW w:w="5634" w:type="dxa"/>
+            <w:tcW w:w="6155" w:type="dxa"/>
             <w:vAlign w:val="center"/>
           </w:tcPr>
           <w:p>
@@ -11990,7 +12087,7 @@
         </w:tc>
         <w:tc>
           <w:tcPr>
-            <w:tcW w:w="3926" w:type="dxa"/>
+            <w:tcW w:w="3405" w:type="dxa"/>
             <w:vAlign w:val="center"/>
           </w:tcPr>
           <w:p>
@@ -12022,7 +12119,7 @@
         </w:tc>
         <w:tc>
           <w:tcPr>
-            <w:tcW w:w="5634" w:type="dxa"/>
+            <w:tcW w:w="6155" w:type="dxa"/>
             <w:vAlign w:val="center"/>
           </w:tcPr>
           <w:p>
@@ -12077,7 +12174,7 @@
         </w:tc>
         <w:tc>
           <w:tcPr>
-            <w:tcW w:w="3926" w:type="dxa"/>
+            <w:tcW w:w="3405" w:type="dxa"/>
             <w:vAlign w:val="center"/>
           </w:tcPr>
           <w:p>
@@ -12101,7 +12198,7 @@
         </w:tc>
         <w:tc>
           <w:tcPr>
-            <w:tcW w:w="5634" w:type="dxa"/>
+            <w:tcW w:w="6155" w:type="dxa"/>
             <w:vAlign w:val="center"/>
           </w:tcPr>
           <w:p>

</xml_diff>

<commit_message>
enveloped -> embedded (signature)
</commit_message>
<xml_diff>
--- a/defensive-publications/partial-encryption-full-signature.docx
+++ b/defensive-publications/partial-encryption-full-signature.docx
@@ -1690,25 +1690,7 @@
                   <w:sz w:val="20"/>
                   <w:szCs w:val="20"/>
                 </w:rPr>
-                <w:t>DE-CB</w:t>
-              </w:r>
-              <w:r>
-                <w:rPr>
-                  <w:rStyle w:val="Hyperlink"/>
-                  <w:rFonts w:ascii="Arial" w:hAnsi="Arial" w:cs="Arial"/>
-                  <w:sz w:val="20"/>
-                  <w:szCs w:val="20"/>
-                </w:rPr>
-                <w:t>O</w:t>
-              </w:r>
-              <w:r>
-                <w:rPr>
-                  <w:rStyle w:val="Hyperlink"/>
-                  <w:rFonts w:ascii="Arial" w:hAnsi="Arial" w:cs="Arial"/>
-                  <w:sz w:val="20"/>
-                  <w:szCs w:val="20"/>
-                </w:rPr>
-                <w:t>R</w:t>
+                <w:t>DE-CBOR</w:t>
               </w:r>
             </w:hyperlink>
             <w:r>
@@ -4124,7 +4106,23 @@
           <w:sz w:val="20"/>
           <w:szCs w:val="20"/>
         </w:rPr>
-        <w:t>dding an enveloped CBOR signature [</w:t>
+        <w:t>dding an e</w:t>
+      </w:r>
+      <w:r>
+        <w:rPr>
+          <w:rFonts w:ascii="Arial" w:hAnsi="Arial" w:cs="Arial"/>
+          <w:sz w:val="20"/>
+          <w:szCs w:val="20"/>
+        </w:rPr>
+        <w:t>mbedded</w:t>
+      </w:r>
+      <w:r>
+        <w:rPr>
+          <w:rFonts w:ascii="Arial" w:hAnsi="Arial" w:cs="Arial"/>
+          <w:sz w:val="20"/>
+          <w:szCs w:val="20"/>
+        </w:rPr>
+        <w:t xml:space="preserve"> CBOR signature [</w:t>
       </w:r>
       <w:hyperlink w:anchor="CSF" w:history="1">
         <w:r>
@@ -5389,7 +5387,25 @@
           <w:sz w:val="20"/>
           <w:szCs w:val="20"/>
         </w:rPr>
-        <w:t xml:space="preserve">enveloped </w:t>
+        <w:t>e</w:t>
+      </w:r>
+      <w:r>
+        <w:rPr>
+          <w:rFonts w:ascii="Arial" w:hAnsi="Arial" w:cs="Arial"/>
+          <w:iCs/>
+          <w:sz w:val="20"/>
+          <w:szCs w:val="20"/>
+        </w:rPr>
+        <w:t>mbedd</w:t>
+      </w:r>
+      <w:r>
+        <w:rPr>
+          <w:rFonts w:ascii="Arial" w:hAnsi="Arial" w:cs="Arial"/>
+          <w:iCs/>
+          <w:sz w:val="20"/>
+          <w:szCs w:val="20"/>
+        </w:rPr>
+        <w:t xml:space="preserve">ed </w:t>
       </w:r>
       <w:r>
         <w:rPr>
@@ -11483,7 +11499,15 @@
           <w:sz w:val="20"/>
           <w:szCs w:val="20"/>
         </w:rPr>
-        <w:t>nveloped signature</w:t>
+        <w:t>mbedd</w:t>
+      </w:r>
+      <w:r>
+        <w:rPr>
+          <w:rFonts w:ascii="Arial" w:hAnsi="Arial" w:cs="Arial"/>
+          <w:sz w:val="20"/>
+          <w:szCs w:val="20"/>
+        </w:rPr>
+        <w:t>ed signature</w:t>
       </w:r>
       <w:r>
         <w:rPr>
@@ -11980,25 +12004,7 @@
                 <w:rPr>
                   <w:rStyle w:val="Hyperlink"/>
                 </w:rPr>
-                <w:t>https://datatracker.ietf.org/doc/</w:t>
-              </w:r>
-              <w:r>
-                <w:rPr>
-                  <w:rStyle w:val="Hyperlink"/>
-                </w:rPr>
-                <w:t>d</w:t>
-              </w:r>
-              <w:r>
-                <w:rPr>
-                  <w:rStyle w:val="Hyperlink"/>
-                </w:rPr>
-                <w:t>raft-rundgr</w:t>
-              </w:r>
-              <w:r>
-                <w:rPr>
-                  <w:rStyle w:val="Hyperlink"/>
-                </w:rPr>
-                <w:t>en-cbor-core/</w:t>
+                <w:t>https://datatracker.ietf.org/doc/draft-rundgren-cbor-core/</w:t>
               </w:r>
             </w:hyperlink>
           </w:p>

</xml_diff>